<commit_message>
fixed bug in tables S2-S3
</commit_message>
<xml_diff>
--- a/Table_S2-S4.docx
+++ b/Table_S2-S4.docx
@@ -1832,117 +1832,117 @@
                 <w:szCs w:val="22"/>
                 <w:color w:val="000000"/>
               </w:rPr>
-              <w:t xml:space="preserve">Young lava</w:t>
-            </w:r>
-          </w:p>
-        </w:tc>
-        <w:tc>
-          <w:tcPr>
-            <w:tcBorders>
-              <w:bottom w:val="none" w:sz="0" w:space="0" w:color="000000"/>
-              <w:top w:val="none" w:sz="0" w:space="0" w:color="000000"/>
-              <w:left w:val="none" w:sz="0" w:space="0" w:color="000000"/>
-              <w:right w:val="none" w:sz="0" w:space="0" w:color="000000"/>
-            </w:tcBorders>
-            <w:shd w:val="clear" w:color="auto" w:fill="FFFFFF"/>
-            <w:tcMar>
-              <w:top w:w="0" w:type="dxa"/>
-              <w:bottom w:w="0" w:type="dxa"/>
-              <w:left w:w="0" w:type="dxa"/>
-              <w:right w:w="0" w:type="dxa"/>
-            </w:tcMar>
-            <w:vAlign w:val="center"/>
-          </w:tcPr>
-          <w:p>
-            <w:pPr>
-              <w:pStyle w:val="Normal"/>
-              <w:jc w:val="left"/>
-              <w:pBdr>
-                <w:bottom w:val="none" w:sz="0" w:space="0" w:color="000000"/>
-                <w:top w:val="none" w:sz="0" w:space="0" w:color="000000"/>
-                <w:left w:val="none" w:sz="0" w:space="0" w:color="000000"/>
-                <w:right w:val="none" w:sz="0" w:space="0" w:color="000000"/>
-              </w:pBdr>
-              <w:spacing w:after="100" w:before="100" w:line="240"/>
-              <w:ind w:left="100" w:right="100" w:firstLine="0" w:firstLineChars="0"/>
-              <w:rPr>
-                <w:rFonts w:ascii="Helvetica" w:hAnsi="Helvetica" w:eastAsia="Helvetica" w:cs="Helvetica"/>
-                <w:i w:val="false"/>
-                <w:b w:val="false"/>
-                <w:u w:val="none"/>
-                <w:strike w:val="false"/>
-                <w:sz w:val="22"/>
-                <w:szCs w:val="22"/>
-                <w:color w:val="000000"/>
-              </w:rPr>
-            </w:pPr>
-            <w:r>
-              <w:rPr>
-                <w:rFonts w:ascii="Helvetica" w:hAnsi="Helvetica" w:eastAsia="Helvetica" w:cs="Helvetica"/>
-                <w:i w:val="false"/>
-                <w:b w:val="false"/>
-                <w:u w:val="none"/>
-                <w:strike w:val="false"/>
-                <w:sz w:val="22"/>
-                <w:szCs w:val="22"/>
-                <w:color w:val="000000"/>
-              </w:rPr>
-              <w:t xml:space="preserve">0.638</w:t>
-            </w:r>
-          </w:p>
-        </w:tc>
-        <w:tc>
-          <w:tcPr>
-            <w:tcBorders>
-              <w:bottom w:val="none" w:sz="0" w:space="0" w:color="000000"/>
-              <w:top w:val="none" w:sz="0" w:space="0" w:color="000000"/>
-              <w:left w:val="none" w:sz="0" w:space="0" w:color="000000"/>
-              <w:right w:val="none" w:sz="0" w:space="0" w:color="000000"/>
-            </w:tcBorders>
-            <w:shd w:val="clear" w:color="auto" w:fill="FFFFFF"/>
-            <w:tcMar>
-              <w:top w:w="0" w:type="dxa"/>
-              <w:bottom w:w="0" w:type="dxa"/>
-              <w:left w:w="0" w:type="dxa"/>
-              <w:right w:w="0" w:type="dxa"/>
-            </w:tcMar>
-            <w:vAlign w:val="center"/>
-          </w:tcPr>
-          <w:p>
-            <w:pPr>
-              <w:pStyle w:val="Normal"/>
-              <w:jc w:val="left"/>
-              <w:pBdr>
-                <w:bottom w:val="none" w:sz="0" w:space="0" w:color="000000"/>
-                <w:top w:val="none" w:sz="0" w:space="0" w:color="000000"/>
-                <w:left w:val="none" w:sz="0" w:space="0" w:color="000000"/>
-                <w:right w:val="none" w:sz="0" w:space="0" w:color="000000"/>
-              </w:pBdr>
-              <w:spacing w:after="100" w:before="100" w:line="240"/>
-              <w:ind w:left="100" w:right="100" w:firstLine="0" w:firstLineChars="0"/>
-              <w:rPr>
-                <w:rFonts w:ascii="Helvetica" w:hAnsi="Helvetica" w:eastAsia="Helvetica" w:cs="Helvetica"/>
-                <w:i w:val="false"/>
-                <w:b w:val="false"/>
-                <w:u w:val="none"/>
-                <w:strike w:val="false"/>
-                <w:sz w:val="22"/>
-                <w:szCs w:val="22"/>
-                <w:color w:val="000000"/>
-              </w:rPr>
-            </w:pPr>
-            <w:r>
-              <w:rPr>
-                <w:rFonts w:ascii="Helvetica" w:hAnsi="Helvetica" w:eastAsia="Helvetica" w:cs="Helvetica"/>
-                <w:i w:val="false"/>
-                <w:b w:val="false"/>
-                <w:u w:val="none"/>
-                <w:strike w:val="false"/>
-                <w:sz w:val="22"/>
-                <w:szCs w:val="22"/>
-                <w:color w:val="000000"/>
-              </w:rPr>
-              <w:t xml:space="preserve">-1.777</w:t>
+              <w:t xml:space="preserve">Montane/Subalpine</w:t>
+            </w:r>
+          </w:p>
+        </w:tc>
+        <w:tc>
+          <w:tcPr>
+            <w:tcBorders>
+              <w:bottom w:val="none" w:sz="0" w:space="0" w:color="000000"/>
+              <w:top w:val="none" w:sz="0" w:space="0" w:color="000000"/>
+              <w:left w:val="none" w:sz="0" w:space="0" w:color="000000"/>
+              <w:right w:val="none" w:sz="0" w:space="0" w:color="000000"/>
+            </w:tcBorders>
+            <w:shd w:val="clear" w:color="auto" w:fill="FFFFFF"/>
+            <w:tcMar>
+              <w:top w:w="0" w:type="dxa"/>
+              <w:bottom w:w="0" w:type="dxa"/>
+              <w:left w:w="0" w:type="dxa"/>
+              <w:right w:w="0" w:type="dxa"/>
+            </w:tcMar>
+            <w:vAlign w:val="center"/>
+          </w:tcPr>
+          <w:p>
+            <w:pPr>
+              <w:pStyle w:val="Normal"/>
+              <w:jc w:val="left"/>
+              <w:pBdr>
+                <w:bottom w:val="none" w:sz="0" w:space="0" w:color="000000"/>
+                <w:top w:val="none" w:sz="0" w:space="0" w:color="000000"/>
+                <w:left w:val="none" w:sz="0" w:space="0" w:color="000000"/>
+                <w:right w:val="none" w:sz="0" w:space="0" w:color="000000"/>
+              </w:pBdr>
+              <w:spacing w:after="100" w:before="100" w:line="240"/>
+              <w:ind w:left="100" w:right="100" w:firstLine="0" w:firstLineChars="0"/>
+              <w:rPr>
+                <w:rFonts w:ascii="Helvetica" w:hAnsi="Helvetica" w:eastAsia="Helvetica" w:cs="Helvetica"/>
+                <w:i w:val="false"/>
+                <w:b w:val="false"/>
+                <w:u w:val="none"/>
+                <w:strike w:val="false"/>
+                <w:sz w:val="22"/>
+                <w:szCs w:val="22"/>
+                <w:color w:val="000000"/>
+              </w:rPr>
+            </w:pPr>
+            <w:r>
+              <w:rPr>
+                <w:rFonts w:ascii="Helvetica" w:hAnsi="Helvetica" w:eastAsia="Helvetica" w:cs="Helvetica"/>
+                <w:i w:val="false"/>
+                <w:b w:val="false"/>
+                <w:u w:val="none"/>
+                <w:strike w:val="false"/>
+                <w:sz w:val="22"/>
+                <w:szCs w:val="22"/>
+                <w:color w:val="000000"/>
+              </w:rPr>
+              <w:t xml:space="preserve">0.720</w:t>
+            </w:r>
+          </w:p>
+        </w:tc>
+        <w:tc>
+          <w:tcPr>
+            <w:tcBorders>
+              <w:bottom w:val="none" w:sz="0" w:space="0" w:color="000000"/>
+              <w:top w:val="none" w:sz="0" w:space="0" w:color="000000"/>
+              <w:left w:val="none" w:sz="0" w:space="0" w:color="000000"/>
+              <w:right w:val="none" w:sz="0" w:space="0" w:color="000000"/>
+            </w:tcBorders>
+            <w:shd w:val="clear" w:color="auto" w:fill="FFFFFF"/>
+            <w:tcMar>
+              <w:top w:w="0" w:type="dxa"/>
+              <w:bottom w:w="0" w:type="dxa"/>
+              <w:left w:w="0" w:type="dxa"/>
+              <w:right w:w="0" w:type="dxa"/>
+            </w:tcMar>
+            <w:vAlign w:val="center"/>
+          </w:tcPr>
+          <w:p>
+            <w:pPr>
+              <w:pStyle w:val="Normal"/>
+              <w:jc w:val="left"/>
+              <w:pBdr>
+                <w:bottom w:val="none" w:sz="0" w:space="0" w:color="000000"/>
+                <w:top w:val="none" w:sz="0" w:space="0" w:color="000000"/>
+                <w:left w:val="none" w:sz="0" w:space="0" w:color="000000"/>
+                <w:right w:val="none" w:sz="0" w:space="0" w:color="000000"/>
+              </w:pBdr>
+              <w:spacing w:after="100" w:before="100" w:line="240"/>
+              <w:ind w:left="100" w:right="100" w:firstLine="0" w:firstLineChars="0"/>
+              <w:rPr>
+                <w:rFonts w:ascii="Helvetica" w:hAnsi="Helvetica" w:eastAsia="Helvetica" w:cs="Helvetica"/>
+                <w:i w:val="false"/>
+                <w:b w:val="false"/>
+                <w:u w:val="none"/>
+                <w:strike w:val="false"/>
+                <w:sz w:val="22"/>
+                <w:szCs w:val="22"/>
+                <w:color w:val="000000"/>
+              </w:rPr>
+            </w:pPr>
+            <w:r>
+              <w:rPr>
+                <w:rFonts w:ascii="Helvetica" w:hAnsi="Helvetica" w:eastAsia="Helvetica" w:cs="Helvetica"/>
+                <w:i w:val="false"/>
+                <w:b w:val="false"/>
+                <w:u w:val="none"/>
+                <w:strike w:val="false"/>
+                <w:sz w:val="22"/>
+                <w:szCs w:val="22"/>
+                <w:color w:val="000000"/>
+              </w:rPr>
+              <w:t xml:space="preserve">-1.882</w:t>
             </w:r>
           </w:p>
         </w:tc>
@@ -2167,62 +2167,62 @@
                 <w:szCs w:val="22"/>
                 <w:color w:val="000000"/>
               </w:rPr>
-              <w:t xml:space="preserve">0.720</w:t>
-            </w:r>
-          </w:p>
-        </w:tc>
-        <w:tc>
-          <w:tcPr>
-            <w:tcBorders>
-              <w:bottom w:val="none" w:sz="0" w:space="0" w:color="000000"/>
-              <w:top w:val="none" w:sz="0" w:space="0" w:color="000000"/>
-              <w:left w:val="none" w:sz="0" w:space="0" w:color="000000"/>
-              <w:right w:val="none" w:sz="0" w:space="0" w:color="000000"/>
-            </w:tcBorders>
-            <w:shd w:val="clear" w:color="auto" w:fill="FFFFFF"/>
-            <w:tcMar>
-              <w:top w:w="0" w:type="dxa"/>
-              <w:bottom w:w="0" w:type="dxa"/>
-              <w:left w:w="0" w:type="dxa"/>
-              <w:right w:w="0" w:type="dxa"/>
-            </w:tcMar>
-            <w:vAlign w:val="center"/>
-          </w:tcPr>
-          <w:p>
-            <w:pPr>
-              <w:pStyle w:val="Normal"/>
-              <w:jc w:val="left"/>
-              <w:pBdr>
-                <w:bottom w:val="none" w:sz="0" w:space="0" w:color="000000"/>
-                <w:top w:val="none" w:sz="0" w:space="0" w:color="000000"/>
-                <w:left w:val="none" w:sz="0" w:space="0" w:color="000000"/>
-                <w:right w:val="none" w:sz="0" w:space="0" w:color="000000"/>
-              </w:pBdr>
-              <w:spacing w:after="100" w:before="100" w:line="240"/>
-              <w:ind w:left="100" w:right="100" w:firstLine="0" w:firstLineChars="0"/>
-              <w:rPr>
-                <w:rFonts w:ascii="Helvetica" w:hAnsi="Helvetica" w:eastAsia="Helvetica" w:cs="Helvetica"/>
-                <w:i w:val="false"/>
-                <w:b w:val="false"/>
-                <w:u w:val="none"/>
-                <w:strike w:val="false"/>
-                <w:sz w:val="22"/>
-                <w:szCs w:val="22"/>
-                <w:color w:val="000000"/>
-              </w:rPr>
-            </w:pPr>
-            <w:r>
-              <w:rPr>
-                <w:rFonts w:ascii="Helvetica" w:hAnsi="Helvetica" w:eastAsia="Helvetica" w:cs="Helvetica"/>
-                <w:i w:val="false"/>
-                <w:b w:val="false"/>
-                <w:u w:val="none"/>
-                <w:strike w:val="false"/>
-                <w:sz w:val="22"/>
-                <w:szCs w:val="22"/>
-                <w:color w:val="000000"/>
-              </w:rPr>
-              <w:t xml:space="preserve">-1.882</w:t>
+              <w:t xml:space="preserve">0.638</w:t>
+            </w:r>
+          </w:p>
+        </w:tc>
+        <w:tc>
+          <w:tcPr>
+            <w:tcBorders>
+              <w:bottom w:val="none" w:sz="0" w:space="0" w:color="000000"/>
+              <w:top w:val="none" w:sz="0" w:space="0" w:color="000000"/>
+              <w:left w:val="none" w:sz="0" w:space="0" w:color="000000"/>
+              <w:right w:val="none" w:sz="0" w:space="0" w:color="000000"/>
+            </w:tcBorders>
+            <w:shd w:val="clear" w:color="auto" w:fill="FFFFFF"/>
+            <w:tcMar>
+              <w:top w:w="0" w:type="dxa"/>
+              <w:bottom w:w="0" w:type="dxa"/>
+              <w:left w:w="0" w:type="dxa"/>
+              <w:right w:w="0" w:type="dxa"/>
+            </w:tcMar>
+            <w:vAlign w:val="center"/>
+          </w:tcPr>
+          <w:p>
+            <w:pPr>
+              <w:pStyle w:val="Normal"/>
+              <w:jc w:val="left"/>
+              <w:pBdr>
+                <w:bottom w:val="none" w:sz="0" w:space="0" w:color="000000"/>
+                <w:top w:val="none" w:sz="0" w:space="0" w:color="000000"/>
+                <w:left w:val="none" w:sz="0" w:space="0" w:color="000000"/>
+                <w:right w:val="none" w:sz="0" w:space="0" w:color="000000"/>
+              </w:pBdr>
+              <w:spacing w:after="100" w:before="100" w:line="240"/>
+              <w:ind w:left="100" w:right="100" w:firstLine="0" w:firstLineChars="0"/>
+              <w:rPr>
+                <w:rFonts w:ascii="Helvetica" w:hAnsi="Helvetica" w:eastAsia="Helvetica" w:cs="Helvetica"/>
+                <w:i w:val="false"/>
+                <w:b w:val="false"/>
+                <w:u w:val="none"/>
+                <w:strike w:val="false"/>
+                <w:sz w:val="22"/>
+                <w:szCs w:val="22"/>
+                <w:color w:val="000000"/>
+              </w:rPr>
+            </w:pPr>
+            <w:r>
+              <w:rPr>
+                <w:rFonts w:ascii="Helvetica" w:hAnsi="Helvetica" w:eastAsia="Helvetica" w:cs="Helvetica"/>
+                <w:i w:val="false"/>
+                <w:b w:val="false"/>
+                <w:u w:val="none"/>
+                <w:strike w:val="false"/>
+                <w:sz w:val="22"/>
+                <w:szCs w:val="22"/>
+                <w:color w:val="000000"/>
+              </w:rPr>
+              <w:t xml:space="preserve">-1.777</w:t>
             </w:r>
           </w:p>
         </w:tc>
@@ -3792,7 +3792,7 @@
                 <w:szCs w:val="22"/>
                 <w:color w:val="000000"/>
               </w:rPr>
-              <w:t xml:space="preserve">Young lava</w:t>
+              <w:t xml:space="preserve">Montane/Subalpine</w:t>
             </w:r>
           </w:p>
         </w:tc>
@@ -5752,7 +5752,7 @@
                 <w:szCs w:val="22"/>
                 <w:color w:val="000000"/>
               </w:rPr>
-              <w:t xml:space="preserve">Young lava</w:t>
+              <w:t xml:space="preserve">Montane/Subalpine</w:t>
             </w:r>
           </w:p>
         </w:tc>
@@ -8031,172 +8031,172 @@
                 <w:szCs w:val="22"/>
                 <w:color w:val="000000"/>
               </w:rPr>
-              <w:t xml:space="preserve">Young lava</w:t>
-            </w:r>
-          </w:p>
-        </w:tc>
-        <w:tc>
-          <w:tcPr>
-            <w:tcBorders>
-              <w:bottom w:val="none" w:sz="0" w:space="0" w:color="000000"/>
-              <w:top w:val="none" w:sz="0" w:space="0" w:color="000000"/>
-              <w:left w:val="none" w:sz="0" w:space="0" w:color="000000"/>
-              <w:right w:val="none" w:sz="0" w:space="0" w:color="000000"/>
-            </w:tcBorders>
-            <w:shd w:val="clear" w:color="auto" w:fill="FFFFFF"/>
-            <w:tcMar>
-              <w:top w:w="0" w:type="dxa"/>
-              <w:bottom w:w="0" w:type="dxa"/>
-              <w:left w:w="0" w:type="dxa"/>
-              <w:right w:w="0" w:type="dxa"/>
-            </w:tcMar>
-            <w:vAlign w:val="center"/>
-          </w:tcPr>
-          <w:p>
-            <w:pPr>
-              <w:pStyle w:val="Normal"/>
-              <w:jc w:val="left"/>
-              <w:pBdr>
-                <w:bottom w:val="none" w:sz="0" w:space="0" w:color="000000"/>
-                <w:top w:val="none" w:sz="0" w:space="0" w:color="000000"/>
-                <w:left w:val="none" w:sz="0" w:space="0" w:color="000000"/>
-                <w:right w:val="none" w:sz="0" w:space="0" w:color="000000"/>
-              </w:pBdr>
-              <w:spacing w:after="100" w:before="100" w:line="240"/>
-              <w:ind w:left="100" w:right="100" w:firstLine="0" w:firstLineChars="0"/>
-              <w:rPr>
-                <w:rFonts w:ascii="Helvetica" w:hAnsi="Helvetica" w:eastAsia="Helvetica" w:cs="Helvetica"/>
-                <w:i w:val="false"/>
-                <w:b w:val="false"/>
-                <w:u w:val="none"/>
-                <w:strike w:val="false"/>
-                <w:sz w:val="22"/>
-                <w:szCs w:val="22"/>
-                <w:color w:val="000000"/>
-              </w:rPr>
-            </w:pPr>
-            <w:r>
-              <w:rPr>
-                <w:rFonts w:ascii="Helvetica" w:hAnsi="Helvetica" w:eastAsia="Helvetica" w:cs="Helvetica"/>
-                <w:i w:val="false"/>
-                <w:b w:val="false"/>
-                <w:u w:val="none"/>
-                <w:strike w:val="false"/>
-                <w:sz w:val="22"/>
-                <w:szCs w:val="22"/>
-                <w:color w:val="000000"/>
-              </w:rPr>
-              <w:t xml:space="preserve">0.245</w:t>
-            </w:r>
-          </w:p>
-        </w:tc>
-        <w:tc>
-          <w:tcPr>
-            <w:tcBorders>
-              <w:bottom w:val="none" w:sz="0" w:space="0" w:color="000000"/>
-              <w:top w:val="none" w:sz="0" w:space="0" w:color="000000"/>
-              <w:left w:val="none" w:sz="0" w:space="0" w:color="000000"/>
-              <w:right w:val="none" w:sz="0" w:space="0" w:color="000000"/>
-            </w:tcBorders>
-            <w:shd w:val="clear" w:color="auto" w:fill="FFFFFF"/>
-            <w:tcMar>
-              <w:top w:w="0" w:type="dxa"/>
-              <w:bottom w:w="0" w:type="dxa"/>
-              <w:left w:w="0" w:type="dxa"/>
-              <w:right w:w="0" w:type="dxa"/>
-            </w:tcMar>
-            <w:vAlign w:val="center"/>
-          </w:tcPr>
-          <w:p>
-            <w:pPr>
-              <w:pStyle w:val="Normal"/>
-              <w:jc w:val="left"/>
-              <w:pBdr>
-                <w:bottom w:val="none" w:sz="0" w:space="0" w:color="000000"/>
-                <w:top w:val="none" w:sz="0" w:space="0" w:color="000000"/>
-                <w:left w:val="none" w:sz="0" w:space="0" w:color="000000"/>
-                <w:right w:val="none" w:sz="0" w:space="0" w:color="000000"/>
-              </w:pBdr>
-              <w:spacing w:after="100" w:before="100" w:line="240"/>
-              <w:ind w:left="100" w:right="100" w:firstLine="0" w:firstLineChars="0"/>
-              <w:rPr>
-                <w:rFonts w:ascii="Helvetica" w:hAnsi="Helvetica" w:eastAsia="Helvetica" w:cs="Helvetica"/>
-                <w:i w:val="false"/>
-                <w:b w:val="false"/>
-                <w:u w:val="none"/>
-                <w:strike w:val="false"/>
-                <w:sz w:val="22"/>
-                <w:szCs w:val="22"/>
-                <w:color w:val="000000"/>
-              </w:rPr>
-            </w:pPr>
-            <w:r>
-              <w:rPr>
-                <w:rFonts w:ascii="Helvetica" w:hAnsi="Helvetica" w:eastAsia="Helvetica" w:cs="Helvetica"/>
-                <w:i w:val="false"/>
-                <w:b w:val="false"/>
-                <w:u w:val="none"/>
-                <w:strike w:val="false"/>
-                <w:sz w:val="22"/>
-                <w:szCs w:val="22"/>
-                <w:color w:val="000000"/>
-              </w:rPr>
-              <w:t xml:space="preserve">-0.726</w:t>
-            </w:r>
-          </w:p>
-        </w:tc>
-        <w:tc>
-          <w:tcPr>
-            <w:tcBorders>
-              <w:bottom w:val="none" w:sz="0" w:space="0" w:color="000000"/>
-              <w:top w:val="none" w:sz="0" w:space="0" w:color="000000"/>
-              <w:left w:val="none" w:sz="0" w:space="0" w:color="000000"/>
-              <w:right w:val="none" w:sz="0" w:space="0" w:color="000000"/>
-            </w:tcBorders>
-            <w:shd w:val="clear" w:color="auto" w:fill="FFFFFF"/>
-            <w:tcMar>
-              <w:top w:w="0" w:type="dxa"/>
-              <w:bottom w:w="0" w:type="dxa"/>
-              <w:left w:w="0" w:type="dxa"/>
-              <w:right w:w="0" w:type="dxa"/>
-            </w:tcMar>
-            <w:vAlign w:val="center"/>
-          </w:tcPr>
-          <w:p>
-            <w:pPr>
-              <w:pStyle w:val="Normal"/>
-              <w:jc w:val="left"/>
-              <w:pBdr>
-                <w:bottom w:val="none" w:sz="0" w:space="0" w:color="000000"/>
-                <w:top w:val="none" w:sz="0" w:space="0" w:color="000000"/>
-                <w:left w:val="none" w:sz="0" w:space="0" w:color="000000"/>
-                <w:right w:val="none" w:sz="0" w:space="0" w:color="000000"/>
-              </w:pBdr>
-              <w:spacing w:after="100" w:before="100" w:line="240"/>
-              <w:ind w:left="100" w:right="100" w:firstLine="0" w:firstLineChars="0"/>
-              <w:rPr>
-                <w:rFonts w:ascii="Helvetica" w:hAnsi="Helvetica" w:eastAsia="Helvetica" w:cs="Helvetica"/>
-                <w:i w:val="false"/>
-                <w:b w:val="false"/>
-                <w:u w:val="none"/>
-                <w:strike w:val="false"/>
-                <w:sz w:val="22"/>
-                <w:szCs w:val="22"/>
-                <w:color w:val="000000"/>
-              </w:rPr>
-            </w:pPr>
-            <w:r>
-              <w:rPr>
-                <w:rFonts w:ascii="Helvetica" w:hAnsi="Helvetica" w:eastAsia="Helvetica" w:cs="Helvetica"/>
-                <w:i w:val="false"/>
-                <w:b w:val="false"/>
-                <w:u w:val="none"/>
-                <w:strike w:val="false"/>
-                <w:sz w:val="22"/>
-                <w:szCs w:val="22"/>
-                <w:color w:val="000000"/>
-              </w:rPr>
-              <w:t xml:space="preserve">0.067</w:t>
+              <w:t xml:space="preserve">Montane/Subalpine</w:t>
+            </w:r>
+          </w:p>
+        </w:tc>
+        <w:tc>
+          <w:tcPr>
+            <w:tcBorders>
+              <w:bottom w:val="none" w:sz="0" w:space="0" w:color="000000"/>
+              <w:top w:val="none" w:sz="0" w:space="0" w:color="000000"/>
+              <w:left w:val="none" w:sz="0" w:space="0" w:color="000000"/>
+              <w:right w:val="none" w:sz="0" w:space="0" w:color="000000"/>
+            </w:tcBorders>
+            <w:shd w:val="clear" w:color="auto" w:fill="FFFFFF"/>
+            <w:tcMar>
+              <w:top w:w="0" w:type="dxa"/>
+              <w:bottom w:w="0" w:type="dxa"/>
+              <w:left w:w="0" w:type="dxa"/>
+              <w:right w:w="0" w:type="dxa"/>
+            </w:tcMar>
+            <w:vAlign w:val="center"/>
+          </w:tcPr>
+          <w:p>
+            <w:pPr>
+              <w:pStyle w:val="Normal"/>
+              <w:jc w:val="left"/>
+              <w:pBdr>
+                <w:bottom w:val="none" w:sz="0" w:space="0" w:color="000000"/>
+                <w:top w:val="none" w:sz="0" w:space="0" w:color="000000"/>
+                <w:left w:val="none" w:sz="0" w:space="0" w:color="000000"/>
+                <w:right w:val="none" w:sz="0" w:space="0" w:color="000000"/>
+              </w:pBdr>
+              <w:spacing w:after="100" w:before="100" w:line="240"/>
+              <w:ind w:left="100" w:right="100" w:firstLine="0" w:firstLineChars="0"/>
+              <w:rPr>
+                <w:rFonts w:ascii="Helvetica" w:hAnsi="Helvetica" w:eastAsia="Helvetica" w:cs="Helvetica"/>
+                <w:i w:val="false"/>
+                <w:b w:val="false"/>
+                <w:u w:val="none"/>
+                <w:strike w:val="false"/>
+                <w:sz w:val="22"/>
+                <w:szCs w:val="22"/>
+                <w:color w:val="000000"/>
+              </w:rPr>
+            </w:pPr>
+            <w:r>
+              <w:rPr>
+                <w:rFonts w:ascii="Helvetica" w:hAnsi="Helvetica" w:eastAsia="Helvetica" w:cs="Helvetica"/>
+                <w:i w:val="false"/>
+                <w:b w:val="false"/>
+                <w:u w:val="none"/>
+                <w:strike w:val="false"/>
+                <w:sz w:val="22"/>
+                <w:szCs w:val="22"/>
+                <w:color w:val="000000"/>
+              </w:rPr>
+              <w:t xml:space="preserve">0.601</w:t>
+            </w:r>
+          </w:p>
+        </w:tc>
+        <w:tc>
+          <w:tcPr>
+            <w:tcBorders>
+              <w:bottom w:val="none" w:sz="0" w:space="0" w:color="000000"/>
+              <w:top w:val="none" w:sz="0" w:space="0" w:color="000000"/>
+              <w:left w:val="none" w:sz="0" w:space="0" w:color="000000"/>
+              <w:right w:val="none" w:sz="0" w:space="0" w:color="000000"/>
+            </w:tcBorders>
+            <w:shd w:val="clear" w:color="auto" w:fill="FFFFFF"/>
+            <w:tcMar>
+              <w:top w:w="0" w:type="dxa"/>
+              <w:bottom w:w="0" w:type="dxa"/>
+              <w:left w:w="0" w:type="dxa"/>
+              <w:right w:w="0" w:type="dxa"/>
+            </w:tcMar>
+            <w:vAlign w:val="center"/>
+          </w:tcPr>
+          <w:p>
+            <w:pPr>
+              <w:pStyle w:val="Normal"/>
+              <w:jc w:val="left"/>
+              <w:pBdr>
+                <w:bottom w:val="none" w:sz="0" w:space="0" w:color="000000"/>
+                <w:top w:val="none" w:sz="0" w:space="0" w:color="000000"/>
+                <w:left w:val="none" w:sz="0" w:space="0" w:color="000000"/>
+                <w:right w:val="none" w:sz="0" w:space="0" w:color="000000"/>
+              </w:pBdr>
+              <w:spacing w:after="100" w:before="100" w:line="240"/>
+              <w:ind w:left="100" w:right="100" w:firstLine="0" w:firstLineChars="0"/>
+              <w:rPr>
+                <w:rFonts w:ascii="Helvetica" w:hAnsi="Helvetica" w:eastAsia="Helvetica" w:cs="Helvetica"/>
+                <w:i w:val="false"/>
+                <w:b w:val="false"/>
+                <w:u w:val="none"/>
+                <w:strike w:val="false"/>
+                <w:sz w:val="22"/>
+                <w:szCs w:val="22"/>
+                <w:color w:val="000000"/>
+              </w:rPr>
+            </w:pPr>
+            <w:r>
+              <w:rPr>
+                <w:rFonts w:ascii="Helvetica" w:hAnsi="Helvetica" w:eastAsia="Helvetica" w:cs="Helvetica"/>
+                <w:i w:val="false"/>
+                <w:b w:val="false"/>
+                <w:u w:val="none"/>
+                <w:strike w:val="false"/>
+                <w:sz w:val="22"/>
+                <w:szCs w:val="22"/>
+                <w:color w:val="000000"/>
+              </w:rPr>
+              <w:t xml:space="preserve">-1.740</w:t>
+            </w:r>
+          </w:p>
+        </w:tc>
+        <w:tc>
+          <w:tcPr>
+            <w:tcBorders>
+              <w:bottom w:val="none" w:sz="0" w:space="0" w:color="000000"/>
+              <w:top w:val="none" w:sz="0" w:space="0" w:color="000000"/>
+              <w:left w:val="none" w:sz="0" w:space="0" w:color="000000"/>
+              <w:right w:val="none" w:sz="0" w:space="0" w:color="000000"/>
+            </w:tcBorders>
+            <w:shd w:val="clear" w:color="auto" w:fill="FFFFFF"/>
+            <w:tcMar>
+              <w:top w:w="0" w:type="dxa"/>
+              <w:bottom w:w="0" w:type="dxa"/>
+              <w:left w:w="0" w:type="dxa"/>
+              <w:right w:w="0" w:type="dxa"/>
+            </w:tcMar>
+            <w:vAlign w:val="center"/>
+          </w:tcPr>
+          <w:p>
+            <w:pPr>
+              <w:pStyle w:val="Normal"/>
+              <w:jc w:val="left"/>
+              <w:pBdr>
+                <w:bottom w:val="none" w:sz="0" w:space="0" w:color="000000"/>
+                <w:top w:val="none" w:sz="0" w:space="0" w:color="000000"/>
+                <w:left w:val="none" w:sz="0" w:space="0" w:color="000000"/>
+                <w:right w:val="none" w:sz="0" w:space="0" w:color="000000"/>
+              </w:pBdr>
+              <w:spacing w:after="100" w:before="100" w:line="240"/>
+              <w:ind w:left="100" w:right="100" w:firstLine="0" w:firstLineChars="0"/>
+              <w:rPr>
+                <w:rFonts w:ascii="Helvetica" w:hAnsi="Helvetica" w:eastAsia="Helvetica" w:cs="Helvetica"/>
+                <w:i w:val="false"/>
+                <w:b w:val="false"/>
+                <w:u w:val="none"/>
+                <w:strike w:val="false"/>
+                <w:sz w:val="22"/>
+                <w:szCs w:val="22"/>
+                <w:color w:val="000000"/>
+              </w:rPr>
+            </w:pPr>
+            <w:r>
+              <w:rPr>
+                <w:rFonts w:ascii="Helvetica" w:hAnsi="Helvetica" w:eastAsia="Helvetica" w:cs="Helvetica"/>
+                <w:i w:val="false"/>
+                <w:b w:val="false"/>
+                <w:u w:val="none"/>
+                <w:strike w:val="false"/>
+                <w:sz w:val="22"/>
+                <w:szCs w:val="22"/>
+                <w:color w:val="000000"/>
+              </w:rPr>
+              <w:t xml:space="preserve">0.010</w:t>
             </w:r>
           </w:p>
         </w:tc>
@@ -8366,117 +8366,117 @@
                 <w:szCs w:val="22"/>
                 <w:color w:val="000000"/>
               </w:rPr>
-              <w:t xml:space="preserve">0.601</w:t>
-            </w:r>
-          </w:p>
-        </w:tc>
-        <w:tc>
-          <w:tcPr>
-            <w:tcBorders>
-              <w:bottom w:val="none" w:sz="0" w:space="0" w:color="000000"/>
-              <w:top w:val="none" w:sz="0" w:space="0" w:color="000000"/>
-              <w:left w:val="none" w:sz="0" w:space="0" w:color="000000"/>
-              <w:right w:val="none" w:sz="0" w:space="0" w:color="000000"/>
-            </w:tcBorders>
-            <w:shd w:val="clear" w:color="auto" w:fill="FFFFFF"/>
-            <w:tcMar>
-              <w:top w:w="0" w:type="dxa"/>
-              <w:bottom w:w="0" w:type="dxa"/>
-              <w:left w:w="0" w:type="dxa"/>
-              <w:right w:w="0" w:type="dxa"/>
-            </w:tcMar>
-            <w:vAlign w:val="center"/>
-          </w:tcPr>
-          <w:p>
-            <w:pPr>
-              <w:pStyle w:val="Normal"/>
-              <w:jc w:val="left"/>
-              <w:pBdr>
-                <w:bottom w:val="none" w:sz="0" w:space="0" w:color="000000"/>
-                <w:top w:val="none" w:sz="0" w:space="0" w:color="000000"/>
-                <w:left w:val="none" w:sz="0" w:space="0" w:color="000000"/>
-                <w:right w:val="none" w:sz="0" w:space="0" w:color="000000"/>
-              </w:pBdr>
-              <w:spacing w:after="100" w:before="100" w:line="240"/>
-              <w:ind w:left="100" w:right="100" w:firstLine="0" w:firstLineChars="0"/>
-              <w:rPr>
-                <w:rFonts w:ascii="Helvetica" w:hAnsi="Helvetica" w:eastAsia="Helvetica" w:cs="Helvetica"/>
-                <w:i w:val="false"/>
-                <w:b w:val="false"/>
-                <w:u w:val="none"/>
-                <w:strike w:val="false"/>
-                <w:sz w:val="22"/>
-                <w:szCs w:val="22"/>
-                <w:color w:val="000000"/>
-              </w:rPr>
-            </w:pPr>
-            <w:r>
-              <w:rPr>
-                <w:rFonts w:ascii="Helvetica" w:hAnsi="Helvetica" w:eastAsia="Helvetica" w:cs="Helvetica"/>
-                <w:i w:val="false"/>
-                <w:b w:val="false"/>
-                <w:u w:val="none"/>
-                <w:strike w:val="false"/>
-                <w:sz w:val="22"/>
-                <w:szCs w:val="22"/>
-                <w:color w:val="000000"/>
-              </w:rPr>
-              <w:t xml:space="preserve">-1.740</w:t>
-            </w:r>
-          </w:p>
-        </w:tc>
-        <w:tc>
-          <w:tcPr>
-            <w:tcBorders>
-              <w:bottom w:val="none" w:sz="0" w:space="0" w:color="000000"/>
-              <w:top w:val="none" w:sz="0" w:space="0" w:color="000000"/>
-              <w:left w:val="none" w:sz="0" w:space="0" w:color="000000"/>
-              <w:right w:val="none" w:sz="0" w:space="0" w:color="000000"/>
-            </w:tcBorders>
-            <w:shd w:val="clear" w:color="auto" w:fill="FFFFFF"/>
-            <w:tcMar>
-              <w:top w:w="0" w:type="dxa"/>
-              <w:bottom w:w="0" w:type="dxa"/>
-              <w:left w:w="0" w:type="dxa"/>
-              <w:right w:w="0" w:type="dxa"/>
-            </w:tcMar>
-            <w:vAlign w:val="center"/>
-          </w:tcPr>
-          <w:p>
-            <w:pPr>
-              <w:pStyle w:val="Normal"/>
-              <w:jc w:val="left"/>
-              <w:pBdr>
-                <w:bottom w:val="none" w:sz="0" w:space="0" w:color="000000"/>
-                <w:top w:val="none" w:sz="0" w:space="0" w:color="000000"/>
-                <w:left w:val="none" w:sz="0" w:space="0" w:color="000000"/>
-                <w:right w:val="none" w:sz="0" w:space="0" w:color="000000"/>
-              </w:pBdr>
-              <w:spacing w:after="100" w:before="100" w:line="240"/>
-              <w:ind w:left="100" w:right="100" w:firstLine="0" w:firstLineChars="0"/>
-              <w:rPr>
-                <w:rFonts w:ascii="Helvetica" w:hAnsi="Helvetica" w:eastAsia="Helvetica" w:cs="Helvetica"/>
-                <w:i w:val="false"/>
-                <w:b w:val="false"/>
-                <w:u w:val="none"/>
-                <w:strike w:val="false"/>
-                <w:sz w:val="22"/>
-                <w:szCs w:val="22"/>
-                <w:color w:val="000000"/>
-              </w:rPr>
-            </w:pPr>
-            <w:r>
-              <w:rPr>
-                <w:rFonts w:ascii="Helvetica" w:hAnsi="Helvetica" w:eastAsia="Helvetica" w:cs="Helvetica"/>
-                <w:i w:val="false"/>
-                <w:b w:val="false"/>
-                <w:u w:val="none"/>
-                <w:strike w:val="false"/>
-                <w:sz w:val="22"/>
-                <w:szCs w:val="22"/>
-                <w:color w:val="000000"/>
-              </w:rPr>
-              <w:t xml:space="preserve">0.010</w:t>
+              <w:t xml:space="preserve">0.245</w:t>
+            </w:r>
+          </w:p>
+        </w:tc>
+        <w:tc>
+          <w:tcPr>
+            <w:tcBorders>
+              <w:bottom w:val="none" w:sz="0" w:space="0" w:color="000000"/>
+              <w:top w:val="none" w:sz="0" w:space="0" w:color="000000"/>
+              <w:left w:val="none" w:sz="0" w:space="0" w:color="000000"/>
+              <w:right w:val="none" w:sz="0" w:space="0" w:color="000000"/>
+            </w:tcBorders>
+            <w:shd w:val="clear" w:color="auto" w:fill="FFFFFF"/>
+            <w:tcMar>
+              <w:top w:w="0" w:type="dxa"/>
+              <w:bottom w:w="0" w:type="dxa"/>
+              <w:left w:w="0" w:type="dxa"/>
+              <w:right w:w="0" w:type="dxa"/>
+            </w:tcMar>
+            <w:vAlign w:val="center"/>
+          </w:tcPr>
+          <w:p>
+            <w:pPr>
+              <w:pStyle w:val="Normal"/>
+              <w:jc w:val="left"/>
+              <w:pBdr>
+                <w:bottom w:val="none" w:sz="0" w:space="0" w:color="000000"/>
+                <w:top w:val="none" w:sz="0" w:space="0" w:color="000000"/>
+                <w:left w:val="none" w:sz="0" w:space="0" w:color="000000"/>
+                <w:right w:val="none" w:sz="0" w:space="0" w:color="000000"/>
+              </w:pBdr>
+              <w:spacing w:after="100" w:before="100" w:line="240"/>
+              <w:ind w:left="100" w:right="100" w:firstLine="0" w:firstLineChars="0"/>
+              <w:rPr>
+                <w:rFonts w:ascii="Helvetica" w:hAnsi="Helvetica" w:eastAsia="Helvetica" w:cs="Helvetica"/>
+                <w:i w:val="false"/>
+                <w:b w:val="false"/>
+                <w:u w:val="none"/>
+                <w:strike w:val="false"/>
+                <w:sz w:val="22"/>
+                <w:szCs w:val="22"/>
+                <w:color w:val="000000"/>
+              </w:rPr>
+            </w:pPr>
+            <w:r>
+              <w:rPr>
+                <w:rFonts w:ascii="Helvetica" w:hAnsi="Helvetica" w:eastAsia="Helvetica" w:cs="Helvetica"/>
+                <w:i w:val="false"/>
+                <w:b w:val="false"/>
+                <w:u w:val="none"/>
+                <w:strike w:val="false"/>
+                <w:sz w:val="22"/>
+                <w:szCs w:val="22"/>
+                <w:color w:val="000000"/>
+              </w:rPr>
+              <w:t xml:space="preserve">-0.726</w:t>
+            </w:r>
+          </w:p>
+        </w:tc>
+        <w:tc>
+          <w:tcPr>
+            <w:tcBorders>
+              <w:bottom w:val="none" w:sz="0" w:space="0" w:color="000000"/>
+              <w:top w:val="none" w:sz="0" w:space="0" w:color="000000"/>
+              <w:left w:val="none" w:sz="0" w:space="0" w:color="000000"/>
+              <w:right w:val="none" w:sz="0" w:space="0" w:color="000000"/>
+            </w:tcBorders>
+            <w:shd w:val="clear" w:color="auto" w:fill="FFFFFF"/>
+            <w:tcMar>
+              <w:top w:w="0" w:type="dxa"/>
+              <w:bottom w:w="0" w:type="dxa"/>
+              <w:left w:w="0" w:type="dxa"/>
+              <w:right w:w="0" w:type="dxa"/>
+            </w:tcMar>
+            <w:vAlign w:val="center"/>
+          </w:tcPr>
+          <w:p>
+            <w:pPr>
+              <w:pStyle w:val="Normal"/>
+              <w:jc w:val="left"/>
+              <w:pBdr>
+                <w:bottom w:val="none" w:sz="0" w:space="0" w:color="000000"/>
+                <w:top w:val="none" w:sz="0" w:space="0" w:color="000000"/>
+                <w:left w:val="none" w:sz="0" w:space="0" w:color="000000"/>
+                <w:right w:val="none" w:sz="0" w:space="0" w:color="000000"/>
+              </w:pBdr>
+              <w:spacing w:after="100" w:before="100" w:line="240"/>
+              <w:ind w:left="100" w:right="100" w:firstLine="0" w:firstLineChars="0"/>
+              <w:rPr>
+                <w:rFonts w:ascii="Helvetica" w:hAnsi="Helvetica" w:eastAsia="Helvetica" w:cs="Helvetica"/>
+                <w:i w:val="false"/>
+                <w:b w:val="false"/>
+                <w:u w:val="none"/>
+                <w:strike w:val="false"/>
+                <w:sz w:val="22"/>
+                <w:szCs w:val="22"/>
+                <w:color w:val="000000"/>
+              </w:rPr>
+            </w:pPr>
+            <w:r>
+              <w:rPr>
+                <w:rFonts w:ascii="Helvetica" w:hAnsi="Helvetica" w:eastAsia="Helvetica" w:cs="Helvetica"/>
+                <w:i w:val="false"/>
+                <w:b w:val="false"/>
+                <w:u w:val="none"/>
+                <w:strike w:val="false"/>
+                <w:sz w:val="22"/>
+                <w:szCs w:val="22"/>
+                <w:color w:val="000000"/>
+              </w:rPr>
+              <w:t xml:space="preserve">0.067</w:t>
             </w:r>
           </w:p>
         </w:tc>
@@ -9991,172 +9991,172 @@
                 <w:szCs w:val="22"/>
                 <w:color w:val="000000"/>
               </w:rPr>
-              <w:t xml:space="preserve">Young lava</w:t>
-            </w:r>
-          </w:p>
-        </w:tc>
-        <w:tc>
-          <w:tcPr>
-            <w:tcBorders>
-              <w:bottom w:val="none" w:sz="0" w:space="0" w:color="000000"/>
-              <w:top w:val="none" w:sz="0" w:space="0" w:color="000000"/>
-              <w:left w:val="none" w:sz="0" w:space="0" w:color="000000"/>
-              <w:right w:val="none" w:sz="0" w:space="0" w:color="000000"/>
-            </w:tcBorders>
-            <w:shd w:val="clear" w:color="auto" w:fill="FFFFFF"/>
-            <w:tcMar>
-              <w:top w:w="0" w:type="dxa"/>
-              <w:bottom w:w="0" w:type="dxa"/>
-              <w:left w:w="0" w:type="dxa"/>
-              <w:right w:w="0" w:type="dxa"/>
-            </w:tcMar>
-            <w:vAlign w:val="center"/>
-          </w:tcPr>
-          <w:p>
-            <w:pPr>
-              <w:pStyle w:val="Normal"/>
-              <w:jc w:val="left"/>
-              <w:pBdr>
-                <w:bottom w:val="none" w:sz="0" w:space="0" w:color="000000"/>
-                <w:top w:val="none" w:sz="0" w:space="0" w:color="000000"/>
-                <w:left w:val="none" w:sz="0" w:space="0" w:color="000000"/>
-                <w:right w:val="none" w:sz="0" w:space="0" w:color="000000"/>
-              </w:pBdr>
-              <w:spacing w:after="100" w:before="100" w:line="240"/>
-              <w:ind w:left="100" w:right="100" w:firstLine="0" w:firstLineChars="0"/>
-              <w:rPr>
-                <w:rFonts w:ascii="Helvetica" w:hAnsi="Helvetica" w:eastAsia="Helvetica" w:cs="Helvetica"/>
-                <w:i w:val="false"/>
-                <w:b w:val="false"/>
-                <w:u w:val="none"/>
-                <w:strike w:val="false"/>
-                <w:sz w:val="22"/>
-                <w:szCs w:val="22"/>
-                <w:color w:val="000000"/>
-              </w:rPr>
-            </w:pPr>
-            <w:r>
-              <w:rPr>
-                <w:rFonts w:ascii="Helvetica" w:hAnsi="Helvetica" w:eastAsia="Helvetica" w:cs="Helvetica"/>
-                <w:i w:val="false"/>
-                <w:b w:val="false"/>
-                <w:u w:val="none"/>
-                <w:strike w:val="false"/>
-                <w:sz w:val="22"/>
-                <w:szCs w:val="22"/>
-                <w:color w:val="000000"/>
-              </w:rPr>
-              <w:t xml:space="preserve">0.001</w:t>
-            </w:r>
-          </w:p>
-        </w:tc>
-        <w:tc>
-          <w:tcPr>
-            <w:tcBorders>
-              <w:bottom w:val="none" w:sz="0" w:space="0" w:color="000000"/>
-              <w:top w:val="none" w:sz="0" w:space="0" w:color="000000"/>
-              <w:left w:val="none" w:sz="0" w:space="0" w:color="000000"/>
-              <w:right w:val="none" w:sz="0" w:space="0" w:color="000000"/>
-            </w:tcBorders>
-            <w:shd w:val="clear" w:color="auto" w:fill="FFFFFF"/>
-            <w:tcMar>
-              <w:top w:w="0" w:type="dxa"/>
-              <w:bottom w:w="0" w:type="dxa"/>
-              <w:left w:w="0" w:type="dxa"/>
-              <w:right w:w="0" w:type="dxa"/>
-            </w:tcMar>
-            <w:vAlign w:val="center"/>
-          </w:tcPr>
-          <w:p>
-            <w:pPr>
-              <w:pStyle w:val="Normal"/>
-              <w:jc w:val="left"/>
-              <w:pBdr>
-                <w:bottom w:val="none" w:sz="0" w:space="0" w:color="000000"/>
-                <w:top w:val="none" w:sz="0" w:space="0" w:color="000000"/>
-                <w:left w:val="none" w:sz="0" w:space="0" w:color="000000"/>
-                <w:right w:val="none" w:sz="0" w:space="0" w:color="000000"/>
-              </w:pBdr>
-              <w:spacing w:after="100" w:before="100" w:line="240"/>
-              <w:ind w:left="100" w:right="100" w:firstLine="0" w:firstLineChars="0"/>
-              <w:rPr>
-                <w:rFonts w:ascii="Helvetica" w:hAnsi="Helvetica" w:eastAsia="Helvetica" w:cs="Helvetica"/>
-                <w:i w:val="false"/>
-                <w:b w:val="false"/>
-                <w:u w:val="none"/>
-                <w:strike w:val="false"/>
-                <w:sz w:val="22"/>
-                <w:szCs w:val="22"/>
-                <w:color w:val="000000"/>
-              </w:rPr>
-            </w:pPr>
-            <w:r>
-              <w:rPr>
-                <w:rFonts w:ascii="Helvetica" w:hAnsi="Helvetica" w:eastAsia="Helvetica" w:cs="Helvetica"/>
-                <w:i w:val="false"/>
-                <w:b w:val="false"/>
-                <w:u w:val="none"/>
-                <w:strike w:val="false"/>
-                <w:sz w:val="22"/>
-                <w:szCs w:val="22"/>
-                <w:color w:val="000000"/>
-              </w:rPr>
-              <w:t xml:space="preserve">2.108</w:t>
-            </w:r>
-          </w:p>
-        </w:tc>
-        <w:tc>
-          <w:tcPr>
-            <w:tcBorders>
-              <w:bottom w:val="none" w:sz="0" w:space="0" w:color="000000"/>
-              <w:top w:val="none" w:sz="0" w:space="0" w:color="000000"/>
-              <w:left w:val="none" w:sz="0" w:space="0" w:color="000000"/>
-              <w:right w:val="none" w:sz="0" w:space="0" w:color="000000"/>
-            </w:tcBorders>
-            <w:shd w:val="clear" w:color="auto" w:fill="FFFFFF"/>
-            <w:tcMar>
-              <w:top w:w="0" w:type="dxa"/>
-              <w:bottom w:w="0" w:type="dxa"/>
-              <w:left w:w="0" w:type="dxa"/>
-              <w:right w:w="0" w:type="dxa"/>
-            </w:tcMar>
-            <w:vAlign w:val="center"/>
-          </w:tcPr>
-          <w:p>
-            <w:pPr>
-              <w:pStyle w:val="Normal"/>
-              <w:jc w:val="left"/>
-              <w:pBdr>
-                <w:bottom w:val="none" w:sz="0" w:space="0" w:color="000000"/>
-                <w:top w:val="none" w:sz="0" w:space="0" w:color="000000"/>
-                <w:left w:val="none" w:sz="0" w:space="0" w:color="000000"/>
-                <w:right w:val="none" w:sz="0" w:space="0" w:color="000000"/>
-              </w:pBdr>
-              <w:spacing w:after="100" w:before="100" w:line="240"/>
-              <w:ind w:left="100" w:right="100" w:firstLine="0" w:firstLineChars="0"/>
-              <w:rPr>
-                <w:rFonts w:ascii="Helvetica" w:hAnsi="Helvetica" w:eastAsia="Helvetica" w:cs="Helvetica"/>
-                <w:i w:val="false"/>
-                <w:b w:val="false"/>
-                <w:u w:val="none"/>
-                <w:strike w:val="false"/>
-                <w:sz w:val="22"/>
-                <w:szCs w:val="22"/>
-                <w:color w:val="000000"/>
-              </w:rPr>
-            </w:pPr>
-            <w:r>
-              <w:rPr>
-                <w:rFonts w:ascii="Helvetica" w:hAnsi="Helvetica" w:eastAsia="Helvetica" w:cs="Helvetica"/>
-                <w:i w:val="false"/>
-                <w:b w:val="false"/>
-                <w:u w:val="none"/>
-                <w:strike w:val="false"/>
-                <w:sz w:val="22"/>
-                <w:szCs w:val="22"/>
-                <w:color w:val="000000"/>
-              </w:rPr>
-              <w:t xml:space="preserve">0.121</w:t>
+              <w:t xml:space="preserve">Montane/Subalpine</w:t>
+            </w:r>
+          </w:p>
+        </w:tc>
+        <w:tc>
+          <w:tcPr>
+            <w:tcBorders>
+              <w:bottom w:val="none" w:sz="0" w:space="0" w:color="000000"/>
+              <w:top w:val="none" w:sz="0" w:space="0" w:color="000000"/>
+              <w:left w:val="none" w:sz="0" w:space="0" w:color="000000"/>
+              <w:right w:val="none" w:sz="0" w:space="0" w:color="000000"/>
+            </w:tcBorders>
+            <w:shd w:val="clear" w:color="auto" w:fill="FFFFFF"/>
+            <w:tcMar>
+              <w:top w:w="0" w:type="dxa"/>
+              <w:bottom w:w="0" w:type="dxa"/>
+              <w:left w:w="0" w:type="dxa"/>
+              <w:right w:w="0" w:type="dxa"/>
+            </w:tcMar>
+            <w:vAlign w:val="center"/>
+          </w:tcPr>
+          <w:p>
+            <w:pPr>
+              <w:pStyle w:val="Normal"/>
+              <w:jc w:val="left"/>
+              <w:pBdr>
+                <w:bottom w:val="none" w:sz="0" w:space="0" w:color="000000"/>
+                <w:top w:val="none" w:sz="0" w:space="0" w:color="000000"/>
+                <w:left w:val="none" w:sz="0" w:space="0" w:color="000000"/>
+                <w:right w:val="none" w:sz="0" w:space="0" w:color="000000"/>
+              </w:pBdr>
+              <w:spacing w:after="100" w:before="100" w:line="240"/>
+              <w:ind w:left="100" w:right="100" w:firstLine="0" w:firstLineChars="0"/>
+              <w:rPr>
+                <w:rFonts w:ascii="Helvetica" w:hAnsi="Helvetica" w:eastAsia="Helvetica" w:cs="Helvetica"/>
+                <w:i w:val="false"/>
+                <w:b w:val="false"/>
+                <w:u w:val="none"/>
+                <w:strike w:val="false"/>
+                <w:sz w:val="22"/>
+                <w:szCs w:val="22"/>
+                <w:color w:val="000000"/>
+              </w:rPr>
+            </w:pPr>
+            <w:r>
+              <w:rPr>
+                <w:rFonts w:ascii="Helvetica" w:hAnsi="Helvetica" w:eastAsia="Helvetica" w:cs="Helvetica"/>
+                <w:i w:val="false"/>
+                <w:b w:val="false"/>
+                <w:u w:val="none"/>
+                <w:strike w:val="false"/>
+                <w:sz w:val="22"/>
+                <w:szCs w:val="22"/>
+                <w:color w:val="000000"/>
+              </w:rPr>
+              <w:t xml:space="preserve">0.308</w:t>
+            </w:r>
+          </w:p>
+        </w:tc>
+        <w:tc>
+          <w:tcPr>
+            <w:tcBorders>
+              <w:bottom w:val="none" w:sz="0" w:space="0" w:color="000000"/>
+              <w:top w:val="none" w:sz="0" w:space="0" w:color="000000"/>
+              <w:left w:val="none" w:sz="0" w:space="0" w:color="000000"/>
+              <w:right w:val="none" w:sz="0" w:space="0" w:color="000000"/>
+            </w:tcBorders>
+            <w:shd w:val="clear" w:color="auto" w:fill="FFFFFF"/>
+            <w:tcMar>
+              <w:top w:w="0" w:type="dxa"/>
+              <w:bottom w:w="0" w:type="dxa"/>
+              <w:left w:w="0" w:type="dxa"/>
+              <w:right w:w="0" w:type="dxa"/>
+            </w:tcMar>
+            <w:vAlign w:val="center"/>
+          </w:tcPr>
+          <w:p>
+            <w:pPr>
+              <w:pStyle w:val="Normal"/>
+              <w:jc w:val="left"/>
+              <w:pBdr>
+                <w:bottom w:val="none" w:sz="0" w:space="0" w:color="000000"/>
+                <w:top w:val="none" w:sz="0" w:space="0" w:color="000000"/>
+                <w:left w:val="none" w:sz="0" w:space="0" w:color="000000"/>
+                <w:right w:val="none" w:sz="0" w:space="0" w:color="000000"/>
+              </w:pBdr>
+              <w:spacing w:after="100" w:before="100" w:line="240"/>
+              <w:ind w:left="100" w:right="100" w:firstLine="0" w:firstLineChars="0"/>
+              <w:rPr>
+                <w:rFonts w:ascii="Helvetica" w:hAnsi="Helvetica" w:eastAsia="Helvetica" w:cs="Helvetica"/>
+                <w:i w:val="false"/>
+                <w:b w:val="false"/>
+                <w:u w:val="none"/>
+                <w:strike w:val="false"/>
+                <w:sz w:val="22"/>
+                <w:szCs w:val="22"/>
+                <w:color w:val="000000"/>
+              </w:rPr>
+            </w:pPr>
+            <w:r>
+              <w:rPr>
+                <w:rFonts w:ascii="Helvetica" w:hAnsi="Helvetica" w:eastAsia="Helvetica" w:cs="Helvetica"/>
+                <w:i w:val="false"/>
+                <w:b w:val="false"/>
+                <w:u w:val="none"/>
+                <w:strike w:val="false"/>
+                <w:sz w:val="22"/>
+                <w:szCs w:val="22"/>
+                <w:color w:val="000000"/>
+              </w:rPr>
+              <w:t xml:space="preserve">-1.187</w:t>
+            </w:r>
+          </w:p>
+        </w:tc>
+        <w:tc>
+          <w:tcPr>
+            <w:tcBorders>
+              <w:bottom w:val="none" w:sz="0" w:space="0" w:color="000000"/>
+              <w:top w:val="none" w:sz="0" w:space="0" w:color="000000"/>
+              <w:left w:val="none" w:sz="0" w:space="0" w:color="000000"/>
+              <w:right w:val="none" w:sz="0" w:space="0" w:color="000000"/>
+            </w:tcBorders>
+            <w:shd w:val="clear" w:color="auto" w:fill="FFFFFF"/>
+            <w:tcMar>
+              <w:top w:w="0" w:type="dxa"/>
+              <w:bottom w:w="0" w:type="dxa"/>
+              <w:left w:w="0" w:type="dxa"/>
+              <w:right w:w="0" w:type="dxa"/>
+            </w:tcMar>
+            <w:vAlign w:val="center"/>
+          </w:tcPr>
+          <w:p>
+            <w:pPr>
+              <w:pStyle w:val="Normal"/>
+              <w:jc w:val="left"/>
+              <w:pBdr>
+                <w:bottom w:val="none" w:sz="0" w:space="0" w:color="000000"/>
+                <w:top w:val="none" w:sz="0" w:space="0" w:color="000000"/>
+                <w:left w:val="none" w:sz="0" w:space="0" w:color="000000"/>
+                <w:right w:val="none" w:sz="0" w:space="0" w:color="000000"/>
+              </w:pBdr>
+              <w:spacing w:after="100" w:before="100" w:line="240"/>
+              <w:ind w:left="100" w:right="100" w:firstLine="0" w:firstLineChars="0"/>
+              <w:rPr>
+                <w:rFonts w:ascii="Helvetica" w:hAnsi="Helvetica" w:eastAsia="Helvetica" w:cs="Helvetica"/>
+                <w:i w:val="false"/>
+                <w:b w:val="false"/>
+                <w:u w:val="none"/>
+                <w:strike w:val="false"/>
+                <w:sz w:val="22"/>
+                <w:szCs w:val="22"/>
+                <w:color w:val="000000"/>
+              </w:rPr>
+            </w:pPr>
+            <w:r>
+              <w:rPr>
+                <w:rFonts w:ascii="Helvetica" w:hAnsi="Helvetica" w:eastAsia="Helvetica" w:cs="Helvetica"/>
+                <w:i w:val="false"/>
+                <w:b w:val="false"/>
+                <w:u w:val="none"/>
+                <w:strike w:val="false"/>
+                <w:sz w:val="22"/>
+                <w:szCs w:val="22"/>
+                <w:color w:val="000000"/>
+              </w:rPr>
+              <w:t xml:space="preserve">0.048</w:t>
             </w:r>
           </w:p>
         </w:tc>
@@ -10326,117 +10326,117 @@
                 <w:szCs w:val="22"/>
                 <w:color w:val="000000"/>
               </w:rPr>
-              <w:t xml:space="preserve">0.308</w:t>
-            </w:r>
-          </w:p>
-        </w:tc>
-        <w:tc>
-          <w:tcPr>
-            <w:tcBorders>
-              <w:bottom w:val="none" w:sz="0" w:space="0" w:color="000000"/>
-              <w:top w:val="none" w:sz="0" w:space="0" w:color="000000"/>
-              <w:left w:val="none" w:sz="0" w:space="0" w:color="000000"/>
-              <w:right w:val="none" w:sz="0" w:space="0" w:color="000000"/>
-            </w:tcBorders>
-            <w:shd w:val="clear" w:color="auto" w:fill="FFFFFF"/>
-            <w:tcMar>
-              <w:top w:w="0" w:type="dxa"/>
-              <w:bottom w:w="0" w:type="dxa"/>
-              <w:left w:w="0" w:type="dxa"/>
-              <w:right w:w="0" w:type="dxa"/>
-            </w:tcMar>
-            <w:vAlign w:val="center"/>
-          </w:tcPr>
-          <w:p>
-            <w:pPr>
-              <w:pStyle w:val="Normal"/>
-              <w:jc w:val="left"/>
-              <w:pBdr>
-                <w:bottom w:val="none" w:sz="0" w:space="0" w:color="000000"/>
-                <w:top w:val="none" w:sz="0" w:space="0" w:color="000000"/>
-                <w:left w:val="none" w:sz="0" w:space="0" w:color="000000"/>
-                <w:right w:val="none" w:sz="0" w:space="0" w:color="000000"/>
-              </w:pBdr>
-              <w:spacing w:after="100" w:before="100" w:line="240"/>
-              <w:ind w:left="100" w:right="100" w:firstLine="0" w:firstLineChars="0"/>
-              <w:rPr>
-                <w:rFonts w:ascii="Helvetica" w:hAnsi="Helvetica" w:eastAsia="Helvetica" w:cs="Helvetica"/>
-                <w:i w:val="false"/>
-                <w:b w:val="false"/>
-                <w:u w:val="none"/>
-                <w:strike w:val="false"/>
-                <w:sz w:val="22"/>
-                <w:szCs w:val="22"/>
-                <w:color w:val="000000"/>
-              </w:rPr>
-            </w:pPr>
-            <w:r>
-              <w:rPr>
-                <w:rFonts w:ascii="Helvetica" w:hAnsi="Helvetica" w:eastAsia="Helvetica" w:cs="Helvetica"/>
-                <w:i w:val="false"/>
-                <w:b w:val="false"/>
-                <w:u w:val="none"/>
-                <w:strike w:val="false"/>
-                <w:sz w:val="22"/>
-                <w:szCs w:val="22"/>
-                <w:color w:val="000000"/>
-              </w:rPr>
-              <w:t xml:space="preserve">-1.187</w:t>
-            </w:r>
-          </w:p>
-        </w:tc>
-        <w:tc>
-          <w:tcPr>
-            <w:tcBorders>
-              <w:bottom w:val="none" w:sz="0" w:space="0" w:color="000000"/>
-              <w:top w:val="none" w:sz="0" w:space="0" w:color="000000"/>
-              <w:left w:val="none" w:sz="0" w:space="0" w:color="000000"/>
-              <w:right w:val="none" w:sz="0" w:space="0" w:color="000000"/>
-            </w:tcBorders>
-            <w:shd w:val="clear" w:color="auto" w:fill="FFFFFF"/>
-            <w:tcMar>
-              <w:top w:w="0" w:type="dxa"/>
-              <w:bottom w:w="0" w:type="dxa"/>
-              <w:left w:w="0" w:type="dxa"/>
-              <w:right w:w="0" w:type="dxa"/>
-            </w:tcMar>
-            <w:vAlign w:val="center"/>
-          </w:tcPr>
-          <w:p>
-            <w:pPr>
-              <w:pStyle w:val="Normal"/>
-              <w:jc w:val="left"/>
-              <w:pBdr>
-                <w:bottom w:val="none" w:sz="0" w:space="0" w:color="000000"/>
-                <w:top w:val="none" w:sz="0" w:space="0" w:color="000000"/>
-                <w:left w:val="none" w:sz="0" w:space="0" w:color="000000"/>
-                <w:right w:val="none" w:sz="0" w:space="0" w:color="000000"/>
-              </w:pBdr>
-              <w:spacing w:after="100" w:before="100" w:line="240"/>
-              <w:ind w:left="100" w:right="100" w:firstLine="0" w:firstLineChars="0"/>
-              <w:rPr>
-                <w:rFonts w:ascii="Helvetica" w:hAnsi="Helvetica" w:eastAsia="Helvetica" w:cs="Helvetica"/>
-                <w:i w:val="false"/>
-                <w:b w:val="false"/>
-                <w:u w:val="none"/>
-                <w:strike w:val="false"/>
-                <w:sz w:val="22"/>
-                <w:szCs w:val="22"/>
-                <w:color w:val="000000"/>
-              </w:rPr>
-            </w:pPr>
-            <w:r>
-              <w:rPr>
-                <w:rFonts w:ascii="Helvetica" w:hAnsi="Helvetica" w:eastAsia="Helvetica" w:cs="Helvetica"/>
-                <w:i w:val="false"/>
-                <w:b w:val="false"/>
-                <w:u w:val="none"/>
-                <w:strike w:val="false"/>
-                <w:sz w:val="22"/>
-                <w:szCs w:val="22"/>
-                <w:color w:val="000000"/>
-              </w:rPr>
-              <w:t xml:space="preserve">0.048</w:t>
+              <w:t xml:space="preserve">0.001</w:t>
+            </w:r>
+          </w:p>
+        </w:tc>
+        <w:tc>
+          <w:tcPr>
+            <w:tcBorders>
+              <w:bottom w:val="none" w:sz="0" w:space="0" w:color="000000"/>
+              <w:top w:val="none" w:sz="0" w:space="0" w:color="000000"/>
+              <w:left w:val="none" w:sz="0" w:space="0" w:color="000000"/>
+              <w:right w:val="none" w:sz="0" w:space="0" w:color="000000"/>
+            </w:tcBorders>
+            <w:shd w:val="clear" w:color="auto" w:fill="FFFFFF"/>
+            <w:tcMar>
+              <w:top w:w="0" w:type="dxa"/>
+              <w:bottom w:w="0" w:type="dxa"/>
+              <w:left w:w="0" w:type="dxa"/>
+              <w:right w:w="0" w:type="dxa"/>
+            </w:tcMar>
+            <w:vAlign w:val="center"/>
+          </w:tcPr>
+          <w:p>
+            <w:pPr>
+              <w:pStyle w:val="Normal"/>
+              <w:jc w:val="left"/>
+              <w:pBdr>
+                <w:bottom w:val="none" w:sz="0" w:space="0" w:color="000000"/>
+                <w:top w:val="none" w:sz="0" w:space="0" w:color="000000"/>
+                <w:left w:val="none" w:sz="0" w:space="0" w:color="000000"/>
+                <w:right w:val="none" w:sz="0" w:space="0" w:color="000000"/>
+              </w:pBdr>
+              <w:spacing w:after="100" w:before="100" w:line="240"/>
+              <w:ind w:left="100" w:right="100" w:firstLine="0" w:firstLineChars="0"/>
+              <w:rPr>
+                <w:rFonts w:ascii="Helvetica" w:hAnsi="Helvetica" w:eastAsia="Helvetica" w:cs="Helvetica"/>
+                <w:i w:val="false"/>
+                <w:b w:val="false"/>
+                <w:u w:val="none"/>
+                <w:strike w:val="false"/>
+                <w:sz w:val="22"/>
+                <w:szCs w:val="22"/>
+                <w:color w:val="000000"/>
+              </w:rPr>
+            </w:pPr>
+            <w:r>
+              <w:rPr>
+                <w:rFonts w:ascii="Helvetica" w:hAnsi="Helvetica" w:eastAsia="Helvetica" w:cs="Helvetica"/>
+                <w:i w:val="false"/>
+                <w:b w:val="false"/>
+                <w:u w:val="none"/>
+                <w:strike w:val="false"/>
+                <w:sz w:val="22"/>
+                <w:szCs w:val="22"/>
+                <w:color w:val="000000"/>
+              </w:rPr>
+              <w:t xml:space="preserve">2.108</w:t>
+            </w:r>
+          </w:p>
+        </w:tc>
+        <w:tc>
+          <w:tcPr>
+            <w:tcBorders>
+              <w:bottom w:val="none" w:sz="0" w:space="0" w:color="000000"/>
+              <w:top w:val="none" w:sz="0" w:space="0" w:color="000000"/>
+              <w:left w:val="none" w:sz="0" w:space="0" w:color="000000"/>
+              <w:right w:val="none" w:sz="0" w:space="0" w:color="000000"/>
+            </w:tcBorders>
+            <w:shd w:val="clear" w:color="auto" w:fill="FFFFFF"/>
+            <w:tcMar>
+              <w:top w:w="0" w:type="dxa"/>
+              <w:bottom w:w="0" w:type="dxa"/>
+              <w:left w:w="0" w:type="dxa"/>
+              <w:right w:w="0" w:type="dxa"/>
+            </w:tcMar>
+            <w:vAlign w:val="center"/>
+          </w:tcPr>
+          <w:p>
+            <w:pPr>
+              <w:pStyle w:val="Normal"/>
+              <w:jc w:val="left"/>
+              <w:pBdr>
+                <w:bottom w:val="none" w:sz="0" w:space="0" w:color="000000"/>
+                <w:top w:val="none" w:sz="0" w:space="0" w:color="000000"/>
+                <w:left w:val="none" w:sz="0" w:space="0" w:color="000000"/>
+                <w:right w:val="none" w:sz="0" w:space="0" w:color="000000"/>
+              </w:pBdr>
+              <w:spacing w:after="100" w:before="100" w:line="240"/>
+              <w:ind w:left="100" w:right="100" w:firstLine="0" w:firstLineChars="0"/>
+              <w:rPr>
+                <w:rFonts w:ascii="Helvetica" w:hAnsi="Helvetica" w:eastAsia="Helvetica" w:cs="Helvetica"/>
+                <w:i w:val="false"/>
+                <w:b w:val="false"/>
+                <w:u w:val="none"/>
+                <w:strike w:val="false"/>
+                <w:sz w:val="22"/>
+                <w:szCs w:val="22"/>
+                <w:color w:val="000000"/>
+              </w:rPr>
+            </w:pPr>
+            <w:r>
+              <w:rPr>
+                <w:rFonts w:ascii="Helvetica" w:hAnsi="Helvetica" w:eastAsia="Helvetica" w:cs="Helvetica"/>
+                <w:i w:val="false"/>
+                <w:b w:val="false"/>
+                <w:u w:val="none"/>
+                <w:strike w:val="false"/>
+                <w:sz w:val="22"/>
+                <w:szCs w:val="22"/>
+                <w:color w:val="000000"/>
+              </w:rPr>
+              <w:t xml:space="preserve">0.121</w:t>
             </w:r>
           </w:p>
         </w:tc>
@@ -11951,172 +11951,172 @@
                 <w:szCs w:val="22"/>
                 <w:color w:val="000000"/>
               </w:rPr>
-              <w:t xml:space="preserve">Young lava</w:t>
-            </w:r>
-          </w:p>
-        </w:tc>
-        <w:tc>
-          <w:tcPr>
-            <w:tcBorders>
-              <w:bottom w:val="none" w:sz="0" w:space="0" w:color="000000"/>
-              <w:top w:val="none" w:sz="0" w:space="0" w:color="000000"/>
-              <w:left w:val="none" w:sz="0" w:space="0" w:color="000000"/>
-              <w:right w:val="none" w:sz="0" w:space="0" w:color="000000"/>
-            </w:tcBorders>
-            <w:shd w:val="clear" w:color="auto" w:fill="FFFFFF"/>
-            <w:tcMar>
-              <w:top w:w="0" w:type="dxa"/>
-              <w:bottom w:w="0" w:type="dxa"/>
-              <w:left w:w="0" w:type="dxa"/>
-              <w:right w:w="0" w:type="dxa"/>
-            </w:tcMar>
-            <w:vAlign w:val="center"/>
-          </w:tcPr>
-          <w:p>
-            <w:pPr>
-              <w:pStyle w:val="Normal"/>
-              <w:jc w:val="left"/>
-              <w:pBdr>
-                <w:bottom w:val="none" w:sz="0" w:space="0" w:color="000000"/>
-                <w:top w:val="none" w:sz="0" w:space="0" w:color="000000"/>
-                <w:left w:val="none" w:sz="0" w:space="0" w:color="000000"/>
-                <w:right w:val="none" w:sz="0" w:space="0" w:color="000000"/>
-              </w:pBdr>
-              <w:spacing w:after="100" w:before="100" w:line="240"/>
-              <w:ind w:left="100" w:right="100" w:firstLine="0" w:firstLineChars="0"/>
-              <w:rPr>
-                <w:rFonts w:ascii="Helvetica" w:hAnsi="Helvetica" w:eastAsia="Helvetica" w:cs="Helvetica"/>
-                <w:i w:val="false"/>
-                <w:b w:val="false"/>
-                <w:u w:val="none"/>
-                <w:strike w:val="false"/>
-                <w:sz w:val="22"/>
-                <w:szCs w:val="22"/>
-                <w:color w:val="000000"/>
-              </w:rPr>
-            </w:pPr>
-            <w:r>
-              <w:rPr>
-                <w:rFonts w:ascii="Helvetica" w:hAnsi="Helvetica" w:eastAsia="Helvetica" w:cs="Helvetica"/>
-                <w:i w:val="false"/>
-                <w:b w:val="false"/>
-                <w:u w:val="none"/>
-                <w:strike w:val="false"/>
-                <w:sz w:val="22"/>
-                <w:szCs w:val="22"/>
-                <w:color w:val="000000"/>
-              </w:rPr>
-              <w:t xml:space="preserve">0.702</w:t>
-            </w:r>
-          </w:p>
-        </w:tc>
-        <w:tc>
-          <w:tcPr>
-            <w:tcBorders>
-              <w:bottom w:val="none" w:sz="0" w:space="0" w:color="000000"/>
-              <w:top w:val="none" w:sz="0" w:space="0" w:color="000000"/>
-              <w:left w:val="none" w:sz="0" w:space="0" w:color="000000"/>
-              <w:right w:val="none" w:sz="0" w:space="0" w:color="000000"/>
-            </w:tcBorders>
-            <w:shd w:val="clear" w:color="auto" w:fill="FFFFFF"/>
-            <w:tcMar>
-              <w:top w:w="0" w:type="dxa"/>
-              <w:bottom w:w="0" w:type="dxa"/>
-              <w:left w:w="0" w:type="dxa"/>
-              <w:right w:w="0" w:type="dxa"/>
-            </w:tcMar>
-            <w:vAlign w:val="center"/>
-          </w:tcPr>
-          <w:p>
-            <w:pPr>
-              <w:pStyle w:val="Normal"/>
-              <w:jc w:val="left"/>
-              <w:pBdr>
-                <w:bottom w:val="none" w:sz="0" w:space="0" w:color="000000"/>
-                <w:top w:val="none" w:sz="0" w:space="0" w:color="000000"/>
-                <w:left w:val="none" w:sz="0" w:space="0" w:color="000000"/>
-                <w:right w:val="none" w:sz="0" w:space="0" w:color="000000"/>
-              </w:pBdr>
-              <w:spacing w:after="100" w:before="100" w:line="240"/>
-              <w:ind w:left="100" w:right="100" w:firstLine="0" w:firstLineChars="0"/>
-              <w:rPr>
-                <w:rFonts w:ascii="Helvetica" w:hAnsi="Helvetica" w:eastAsia="Helvetica" w:cs="Helvetica"/>
-                <w:i w:val="false"/>
-                <w:b w:val="false"/>
-                <w:u w:val="none"/>
-                <w:strike w:val="false"/>
-                <w:sz w:val="22"/>
-                <w:szCs w:val="22"/>
-                <w:color w:val="000000"/>
-              </w:rPr>
-            </w:pPr>
-            <w:r>
-              <w:rPr>
-                <w:rFonts w:ascii="Helvetica" w:hAnsi="Helvetica" w:eastAsia="Helvetica" w:cs="Helvetica"/>
-                <w:i w:val="false"/>
-                <w:b w:val="false"/>
-                <w:u w:val="none"/>
-                <w:strike w:val="false"/>
-                <w:sz w:val="22"/>
-                <w:szCs w:val="22"/>
-                <w:color w:val="000000"/>
-              </w:rPr>
-              <w:t xml:space="preserve">-2.005</w:t>
-            </w:r>
-          </w:p>
-        </w:tc>
-        <w:tc>
-          <w:tcPr>
-            <w:tcBorders>
-              <w:bottom w:val="none" w:sz="0" w:space="0" w:color="000000"/>
-              <w:top w:val="none" w:sz="0" w:space="0" w:color="000000"/>
-              <w:left w:val="none" w:sz="0" w:space="0" w:color="000000"/>
-              <w:right w:val="none" w:sz="0" w:space="0" w:color="000000"/>
-            </w:tcBorders>
-            <w:shd w:val="clear" w:color="auto" w:fill="FFFFFF"/>
-            <w:tcMar>
-              <w:top w:w="0" w:type="dxa"/>
-              <w:bottom w:w="0" w:type="dxa"/>
-              <w:left w:w="0" w:type="dxa"/>
-              <w:right w:w="0" w:type="dxa"/>
-            </w:tcMar>
-            <w:vAlign w:val="center"/>
-          </w:tcPr>
-          <w:p>
-            <w:pPr>
-              <w:pStyle w:val="Normal"/>
-              <w:jc w:val="left"/>
-              <w:pBdr>
-                <w:bottom w:val="none" w:sz="0" w:space="0" w:color="000000"/>
-                <w:top w:val="none" w:sz="0" w:space="0" w:color="000000"/>
-                <w:left w:val="none" w:sz="0" w:space="0" w:color="000000"/>
-                <w:right w:val="none" w:sz="0" w:space="0" w:color="000000"/>
-              </w:pBdr>
-              <w:spacing w:after="100" w:before="100" w:line="240"/>
-              <w:ind w:left="100" w:right="100" w:firstLine="0" w:firstLineChars="0"/>
-              <w:rPr>
-                <w:rFonts w:ascii="Helvetica" w:hAnsi="Helvetica" w:eastAsia="Helvetica" w:cs="Helvetica"/>
-                <w:i w:val="false"/>
-                <w:b w:val="false"/>
-                <w:u w:val="none"/>
-                <w:strike w:val="false"/>
-                <w:sz w:val="22"/>
-                <w:szCs w:val="22"/>
-                <w:color w:val="000000"/>
-              </w:rPr>
-            </w:pPr>
-            <w:r>
-              <w:rPr>
-                <w:rFonts w:ascii="Helvetica" w:hAnsi="Helvetica" w:eastAsia="Helvetica" w:cs="Helvetica"/>
-                <w:i w:val="false"/>
-                <w:b w:val="false"/>
-                <w:u w:val="none"/>
-                <w:strike w:val="false"/>
-                <w:sz w:val="22"/>
-                <w:szCs w:val="22"/>
-                <w:color w:val="000000"/>
-              </w:rPr>
-              <w:t xml:space="preserve">0.018</w:t>
+              <w:t xml:space="preserve">Montane/Subalpine</w:t>
+            </w:r>
+          </w:p>
+        </w:tc>
+        <w:tc>
+          <w:tcPr>
+            <w:tcBorders>
+              <w:bottom w:val="none" w:sz="0" w:space="0" w:color="000000"/>
+              <w:top w:val="none" w:sz="0" w:space="0" w:color="000000"/>
+              <w:left w:val="none" w:sz="0" w:space="0" w:color="000000"/>
+              <w:right w:val="none" w:sz="0" w:space="0" w:color="000000"/>
+            </w:tcBorders>
+            <w:shd w:val="clear" w:color="auto" w:fill="FFFFFF"/>
+            <w:tcMar>
+              <w:top w:w="0" w:type="dxa"/>
+              <w:bottom w:w="0" w:type="dxa"/>
+              <w:left w:w="0" w:type="dxa"/>
+              <w:right w:w="0" w:type="dxa"/>
+            </w:tcMar>
+            <w:vAlign w:val="center"/>
+          </w:tcPr>
+          <w:p>
+            <w:pPr>
+              <w:pStyle w:val="Normal"/>
+              <w:jc w:val="left"/>
+              <w:pBdr>
+                <w:bottom w:val="none" w:sz="0" w:space="0" w:color="000000"/>
+                <w:top w:val="none" w:sz="0" w:space="0" w:color="000000"/>
+                <w:left w:val="none" w:sz="0" w:space="0" w:color="000000"/>
+                <w:right w:val="none" w:sz="0" w:space="0" w:color="000000"/>
+              </w:pBdr>
+              <w:spacing w:after="100" w:before="100" w:line="240"/>
+              <w:ind w:left="100" w:right="100" w:firstLine="0" w:firstLineChars="0"/>
+              <w:rPr>
+                <w:rFonts w:ascii="Helvetica" w:hAnsi="Helvetica" w:eastAsia="Helvetica" w:cs="Helvetica"/>
+                <w:i w:val="false"/>
+                <w:b w:val="false"/>
+                <w:u w:val="none"/>
+                <w:strike w:val="false"/>
+                <w:sz w:val="22"/>
+                <w:szCs w:val="22"/>
+                <w:color w:val="000000"/>
+              </w:rPr>
+            </w:pPr>
+            <w:r>
+              <w:rPr>
+                <w:rFonts w:ascii="Helvetica" w:hAnsi="Helvetica" w:eastAsia="Helvetica" w:cs="Helvetica"/>
+                <w:i w:val="false"/>
+                <w:b w:val="false"/>
+                <w:u w:val="none"/>
+                <w:strike w:val="false"/>
+                <w:sz w:val="22"/>
+                <w:szCs w:val="22"/>
+                <w:color w:val="000000"/>
+              </w:rPr>
+              <w:t xml:space="preserve">0.962</w:t>
+            </w:r>
+          </w:p>
+        </w:tc>
+        <w:tc>
+          <w:tcPr>
+            <w:tcBorders>
+              <w:bottom w:val="none" w:sz="0" w:space="0" w:color="000000"/>
+              <w:top w:val="none" w:sz="0" w:space="0" w:color="000000"/>
+              <w:left w:val="none" w:sz="0" w:space="0" w:color="000000"/>
+              <w:right w:val="none" w:sz="0" w:space="0" w:color="000000"/>
+            </w:tcBorders>
+            <w:shd w:val="clear" w:color="auto" w:fill="FFFFFF"/>
+            <w:tcMar>
+              <w:top w:w="0" w:type="dxa"/>
+              <w:bottom w:w="0" w:type="dxa"/>
+              <w:left w:w="0" w:type="dxa"/>
+              <w:right w:w="0" w:type="dxa"/>
+            </w:tcMar>
+            <w:vAlign w:val="center"/>
+          </w:tcPr>
+          <w:p>
+            <w:pPr>
+              <w:pStyle w:val="Normal"/>
+              <w:jc w:val="left"/>
+              <w:pBdr>
+                <w:bottom w:val="none" w:sz="0" w:space="0" w:color="000000"/>
+                <w:top w:val="none" w:sz="0" w:space="0" w:color="000000"/>
+                <w:left w:val="none" w:sz="0" w:space="0" w:color="000000"/>
+                <w:right w:val="none" w:sz="0" w:space="0" w:color="000000"/>
+              </w:pBdr>
+              <w:spacing w:after="100" w:before="100" w:line="240"/>
+              <w:ind w:left="100" w:right="100" w:firstLine="0" w:firstLineChars="0"/>
+              <w:rPr>
+                <w:rFonts w:ascii="Helvetica" w:hAnsi="Helvetica" w:eastAsia="Helvetica" w:cs="Helvetica"/>
+                <w:i w:val="false"/>
+                <w:b w:val="false"/>
+                <w:u w:val="none"/>
+                <w:strike w:val="false"/>
+                <w:sz w:val="22"/>
+                <w:szCs w:val="22"/>
+                <w:color w:val="000000"/>
+              </w:rPr>
+            </w:pPr>
+            <w:r>
+              <w:rPr>
+                <w:rFonts w:ascii="Helvetica" w:hAnsi="Helvetica" w:eastAsia="Helvetica" w:cs="Helvetica"/>
+                <w:i w:val="false"/>
+                <w:b w:val="false"/>
+                <w:u w:val="none"/>
+                <w:strike w:val="false"/>
+                <w:sz w:val="22"/>
+                <w:szCs w:val="22"/>
+                <w:color w:val="000000"/>
+              </w:rPr>
+              <w:t xml:space="preserve">-1.960</w:t>
+            </w:r>
+          </w:p>
+        </w:tc>
+        <w:tc>
+          <w:tcPr>
+            <w:tcBorders>
+              <w:bottom w:val="none" w:sz="0" w:space="0" w:color="000000"/>
+              <w:top w:val="none" w:sz="0" w:space="0" w:color="000000"/>
+              <w:left w:val="none" w:sz="0" w:space="0" w:color="000000"/>
+              <w:right w:val="none" w:sz="0" w:space="0" w:color="000000"/>
+            </w:tcBorders>
+            <w:shd w:val="clear" w:color="auto" w:fill="FFFFFF"/>
+            <w:tcMar>
+              <w:top w:w="0" w:type="dxa"/>
+              <w:bottom w:w="0" w:type="dxa"/>
+              <w:left w:w="0" w:type="dxa"/>
+              <w:right w:w="0" w:type="dxa"/>
+            </w:tcMar>
+            <w:vAlign w:val="center"/>
+          </w:tcPr>
+          <w:p>
+            <w:pPr>
+              <w:pStyle w:val="Normal"/>
+              <w:jc w:val="left"/>
+              <w:pBdr>
+                <w:bottom w:val="none" w:sz="0" w:space="0" w:color="000000"/>
+                <w:top w:val="none" w:sz="0" w:space="0" w:color="000000"/>
+                <w:left w:val="none" w:sz="0" w:space="0" w:color="000000"/>
+                <w:right w:val="none" w:sz="0" w:space="0" w:color="000000"/>
+              </w:pBdr>
+              <w:spacing w:after="100" w:before="100" w:line="240"/>
+              <w:ind w:left="100" w:right="100" w:firstLine="0" w:firstLineChars="0"/>
+              <w:rPr>
+                <w:rFonts w:ascii="Helvetica" w:hAnsi="Helvetica" w:eastAsia="Helvetica" w:cs="Helvetica"/>
+                <w:i w:val="false"/>
+                <w:b w:val="false"/>
+                <w:u w:val="none"/>
+                <w:strike w:val="false"/>
+                <w:sz w:val="22"/>
+                <w:szCs w:val="22"/>
+                <w:color w:val="000000"/>
+              </w:rPr>
+            </w:pPr>
+            <w:r>
+              <w:rPr>
+                <w:rFonts w:ascii="Helvetica" w:hAnsi="Helvetica" w:eastAsia="Helvetica" w:cs="Helvetica"/>
+                <w:i w:val="false"/>
+                <w:b w:val="false"/>
+                <w:u w:val="none"/>
+                <w:strike w:val="false"/>
+                <w:sz w:val="22"/>
+                <w:szCs w:val="22"/>
+                <w:color w:val="000000"/>
+              </w:rPr>
+              <w:t xml:space="preserve">0.021</w:t>
             </w:r>
           </w:p>
         </w:tc>
@@ -12286,117 +12286,117 @@
                 <w:szCs w:val="22"/>
                 <w:color w:val="000000"/>
               </w:rPr>
-              <w:t xml:space="preserve">0.962</w:t>
-            </w:r>
-          </w:p>
-        </w:tc>
-        <w:tc>
-          <w:tcPr>
-            <w:tcBorders>
-              <w:bottom w:val="none" w:sz="0" w:space="0" w:color="000000"/>
-              <w:top w:val="none" w:sz="0" w:space="0" w:color="000000"/>
-              <w:left w:val="none" w:sz="0" w:space="0" w:color="000000"/>
-              <w:right w:val="none" w:sz="0" w:space="0" w:color="000000"/>
-            </w:tcBorders>
-            <w:shd w:val="clear" w:color="auto" w:fill="FFFFFF"/>
-            <w:tcMar>
-              <w:top w:w="0" w:type="dxa"/>
-              <w:bottom w:w="0" w:type="dxa"/>
-              <w:left w:w="0" w:type="dxa"/>
-              <w:right w:w="0" w:type="dxa"/>
-            </w:tcMar>
-            <w:vAlign w:val="center"/>
-          </w:tcPr>
-          <w:p>
-            <w:pPr>
-              <w:pStyle w:val="Normal"/>
-              <w:jc w:val="left"/>
-              <w:pBdr>
-                <w:bottom w:val="none" w:sz="0" w:space="0" w:color="000000"/>
-                <w:top w:val="none" w:sz="0" w:space="0" w:color="000000"/>
-                <w:left w:val="none" w:sz="0" w:space="0" w:color="000000"/>
-                <w:right w:val="none" w:sz="0" w:space="0" w:color="000000"/>
-              </w:pBdr>
-              <w:spacing w:after="100" w:before="100" w:line="240"/>
-              <w:ind w:left="100" w:right="100" w:firstLine="0" w:firstLineChars="0"/>
-              <w:rPr>
-                <w:rFonts w:ascii="Helvetica" w:hAnsi="Helvetica" w:eastAsia="Helvetica" w:cs="Helvetica"/>
-                <w:i w:val="false"/>
-                <w:b w:val="false"/>
-                <w:u w:val="none"/>
-                <w:strike w:val="false"/>
-                <w:sz w:val="22"/>
-                <w:szCs w:val="22"/>
-                <w:color w:val="000000"/>
-              </w:rPr>
-            </w:pPr>
-            <w:r>
-              <w:rPr>
-                <w:rFonts w:ascii="Helvetica" w:hAnsi="Helvetica" w:eastAsia="Helvetica" w:cs="Helvetica"/>
-                <w:i w:val="false"/>
-                <w:b w:val="false"/>
-                <w:u w:val="none"/>
-                <w:strike w:val="false"/>
-                <w:sz w:val="22"/>
-                <w:szCs w:val="22"/>
-                <w:color w:val="000000"/>
-              </w:rPr>
-              <w:t xml:space="preserve">-1.960</w:t>
-            </w:r>
-          </w:p>
-        </w:tc>
-        <w:tc>
-          <w:tcPr>
-            <w:tcBorders>
-              <w:bottom w:val="none" w:sz="0" w:space="0" w:color="000000"/>
-              <w:top w:val="none" w:sz="0" w:space="0" w:color="000000"/>
-              <w:left w:val="none" w:sz="0" w:space="0" w:color="000000"/>
-              <w:right w:val="none" w:sz="0" w:space="0" w:color="000000"/>
-            </w:tcBorders>
-            <w:shd w:val="clear" w:color="auto" w:fill="FFFFFF"/>
-            <w:tcMar>
-              <w:top w:w="0" w:type="dxa"/>
-              <w:bottom w:w="0" w:type="dxa"/>
-              <w:left w:w="0" w:type="dxa"/>
-              <w:right w:w="0" w:type="dxa"/>
-            </w:tcMar>
-            <w:vAlign w:val="center"/>
-          </w:tcPr>
-          <w:p>
-            <w:pPr>
-              <w:pStyle w:val="Normal"/>
-              <w:jc w:val="left"/>
-              <w:pBdr>
-                <w:bottom w:val="none" w:sz="0" w:space="0" w:color="000000"/>
-                <w:top w:val="none" w:sz="0" w:space="0" w:color="000000"/>
-                <w:left w:val="none" w:sz="0" w:space="0" w:color="000000"/>
-                <w:right w:val="none" w:sz="0" w:space="0" w:color="000000"/>
-              </w:pBdr>
-              <w:spacing w:after="100" w:before="100" w:line="240"/>
-              <w:ind w:left="100" w:right="100" w:firstLine="0" w:firstLineChars="0"/>
-              <w:rPr>
-                <w:rFonts w:ascii="Helvetica" w:hAnsi="Helvetica" w:eastAsia="Helvetica" w:cs="Helvetica"/>
-                <w:i w:val="false"/>
-                <w:b w:val="false"/>
-                <w:u w:val="none"/>
-                <w:strike w:val="false"/>
-                <w:sz w:val="22"/>
-                <w:szCs w:val="22"/>
-                <w:color w:val="000000"/>
-              </w:rPr>
-            </w:pPr>
-            <w:r>
-              <w:rPr>
-                <w:rFonts w:ascii="Helvetica" w:hAnsi="Helvetica" w:eastAsia="Helvetica" w:cs="Helvetica"/>
-                <w:i w:val="false"/>
-                <w:b w:val="false"/>
-                <w:u w:val="none"/>
-                <w:strike w:val="false"/>
-                <w:sz w:val="22"/>
-                <w:szCs w:val="22"/>
-                <w:color w:val="000000"/>
-              </w:rPr>
-              <w:t xml:space="preserve">0.021</w:t>
+              <w:t xml:space="preserve">0.702</w:t>
+            </w:r>
+          </w:p>
+        </w:tc>
+        <w:tc>
+          <w:tcPr>
+            <w:tcBorders>
+              <w:bottom w:val="none" w:sz="0" w:space="0" w:color="000000"/>
+              <w:top w:val="none" w:sz="0" w:space="0" w:color="000000"/>
+              <w:left w:val="none" w:sz="0" w:space="0" w:color="000000"/>
+              <w:right w:val="none" w:sz="0" w:space="0" w:color="000000"/>
+            </w:tcBorders>
+            <w:shd w:val="clear" w:color="auto" w:fill="FFFFFF"/>
+            <w:tcMar>
+              <w:top w:w="0" w:type="dxa"/>
+              <w:bottom w:w="0" w:type="dxa"/>
+              <w:left w:w="0" w:type="dxa"/>
+              <w:right w:w="0" w:type="dxa"/>
+            </w:tcMar>
+            <w:vAlign w:val="center"/>
+          </w:tcPr>
+          <w:p>
+            <w:pPr>
+              <w:pStyle w:val="Normal"/>
+              <w:jc w:val="left"/>
+              <w:pBdr>
+                <w:bottom w:val="none" w:sz="0" w:space="0" w:color="000000"/>
+                <w:top w:val="none" w:sz="0" w:space="0" w:color="000000"/>
+                <w:left w:val="none" w:sz="0" w:space="0" w:color="000000"/>
+                <w:right w:val="none" w:sz="0" w:space="0" w:color="000000"/>
+              </w:pBdr>
+              <w:spacing w:after="100" w:before="100" w:line="240"/>
+              <w:ind w:left="100" w:right="100" w:firstLine="0" w:firstLineChars="0"/>
+              <w:rPr>
+                <w:rFonts w:ascii="Helvetica" w:hAnsi="Helvetica" w:eastAsia="Helvetica" w:cs="Helvetica"/>
+                <w:i w:val="false"/>
+                <w:b w:val="false"/>
+                <w:u w:val="none"/>
+                <w:strike w:val="false"/>
+                <w:sz w:val="22"/>
+                <w:szCs w:val="22"/>
+                <w:color w:val="000000"/>
+              </w:rPr>
+            </w:pPr>
+            <w:r>
+              <w:rPr>
+                <w:rFonts w:ascii="Helvetica" w:hAnsi="Helvetica" w:eastAsia="Helvetica" w:cs="Helvetica"/>
+                <w:i w:val="false"/>
+                <w:b w:val="false"/>
+                <w:u w:val="none"/>
+                <w:strike w:val="false"/>
+                <w:sz w:val="22"/>
+                <w:szCs w:val="22"/>
+                <w:color w:val="000000"/>
+              </w:rPr>
+              <w:t xml:space="preserve">-2.005</w:t>
+            </w:r>
+          </w:p>
+        </w:tc>
+        <w:tc>
+          <w:tcPr>
+            <w:tcBorders>
+              <w:bottom w:val="none" w:sz="0" w:space="0" w:color="000000"/>
+              <w:top w:val="none" w:sz="0" w:space="0" w:color="000000"/>
+              <w:left w:val="none" w:sz="0" w:space="0" w:color="000000"/>
+              <w:right w:val="none" w:sz="0" w:space="0" w:color="000000"/>
+            </w:tcBorders>
+            <w:shd w:val="clear" w:color="auto" w:fill="FFFFFF"/>
+            <w:tcMar>
+              <w:top w:w="0" w:type="dxa"/>
+              <w:bottom w:w="0" w:type="dxa"/>
+              <w:left w:w="0" w:type="dxa"/>
+              <w:right w:w="0" w:type="dxa"/>
+            </w:tcMar>
+            <w:vAlign w:val="center"/>
+          </w:tcPr>
+          <w:p>
+            <w:pPr>
+              <w:pStyle w:val="Normal"/>
+              <w:jc w:val="left"/>
+              <w:pBdr>
+                <w:bottom w:val="none" w:sz="0" w:space="0" w:color="000000"/>
+                <w:top w:val="none" w:sz="0" w:space="0" w:color="000000"/>
+                <w:left w:val="none" w:sz="0" w:space="0" w:color="000000"/>
+                <w:right w:val="none" w:sz="0" w:space="0" w:color="000000"/>
+              </w:pBdr>
+              <w:spacing w:after="100" w:before="100" w:line="240"/>
+              <w:ind w:left="100" w:right="100" w:firstLine="0" w:firstLineChars="0"/>
+              <w:rPr>
+                <w:rFonts w:ascii="Helvetica" w:hAnsi="Helvetica" w:eastAsia="Helvetica" w:cs="Helvetica"/>
+                <w:i w:val="false"/>
+                <w:b w:val="false"/>
+                <w:u w:val="none"/>
+                <w:strike w:val="false"/>
+                <w:sz w:val="22"/>
+                <w:szCs w:val="22"/>
+                <w:color w:val="000000"/>
+              </w:rPr>
+            </w:pPr>
+            <w:r>
+              <w:rPr>
+                <w:rFonts w:ascii="Helvetica" w:hAnsi="Helvetica" w:eastAsia="Helvetica" w:cs="Helvetica"/>
+                <w:i w:val="false"/>
+                <w:b w:val="false"/>
+                <w:u w:val="none"/>
+                <w:strike w:val="false"/>
+                <w:sz w:val="22"/>
+                <w:szCs w:val="22"/>
+                <w:color w:val="000000"/>
+              </w:rPr>
+              <w:t xml:space="preserve">0.018</w:t>
             </w:r>
           </w:p>
         </w:tc>
@@ -13911,172 +13911,172 @@
                 <w:szCs w:val="22"/>
                 <w:color w:val="000000"/>
               </w:rPr>
-              <w:t xml:space="preserve">Young lava</w:t>
-            </w:r>
-          </w:p>
-        </w:tc>
-        <w:tc>
-          <w:tcPr>
-            <w:tcBorders>
-              <w:bottom w:val="none" w:sz="0" w:space="0" w:color="000000"/>
-              <w:top w:val="none" w:sz="0" w:space="0" w:color="000000"/>
-              <w:left w:val="none" w:sz="0" w:space="0" w:color="000000"/>
-              <w:right w:val="none" w:sz="0" w:space="0" w:color="000000"/>
-            </w:tcBorders>
-            <w:shd w:val="clear" w:color="auto" w:fill="FFFFFF"/>
-            <w:tcMar>
-              <w:top w:w="0" w:type="dxa"/>
-              <w:bottom w:w="0" w:type="dxa"/>
-              <w:left w:w="0" w:type="dxa"/>
-              <w:right w:w="0" w:type="dxa"/>
-            </w:tcMar>
-            <w:vAlign w:val="center"/>
-          </w:tcPr>
-          <w:p>
-            <w:pPr>
-              <w:pStyle w:val="Normal"/>
-              <w:jc w:val="left"/>
-              <w:pBdr>
-                <w:bottom w:val="none" w:sz="0" w:space="0" w:color="000000"/>
-                <w:top w:val="none" w:sz="0" w:space="0" w:color="000000"/>
-                <w:left w:val="none" w:sz="0" w:space="0" w:color="000000"/>
-                <w:right w:val="none" w:sz="0" w:space="0" w:color="000000"/>
-              </w:pBdr>
-              <w:spacing w:after="100" w:before="100" w:line="240"/>
-              <w:ind w:left="100" w:right="100" w:firstLine="0" w:firstLineChars="0"/>
-              <w:rPr>
-                <w:rFonts w:ascii="Helvetica" w:hAnsi="Helvetica" w:eastAsia="Helvetica" w:cs="Helvetica"/>
-                <w:i w:val="false"/>
-                <w:b w:val="false"/>
-                <w:u w:val="none"/>
-                <w:strike w:val="false"/>
-                <w:sz w:val="22"/>
-                <w:szCs w:val="22"/>
-                <w:color w:val="000000"/>
-              </w:rPr>
-            </w:pPr>
-            <w:r>
-              <w:rPr>
-                <w:rFonts w:ascii="Helvetica" w:hAnsi="Helvetica" w:eastAsia="Helvetica" w:cs="Helvetica"/>
-                <w:i w:val="false"/>
-                <w:b w:val="false"/>
-                <w:u w:val="none"/>
-                <w:strike w:val="false"/>
-                <w:sz w:val="22"/>
-                <w:szCs w:val="22"/>
-                <w:color w:val="000000"/>
-              </w:rPr>
-              <w:t xml:space="preserve">0.605</w:t>
-            </w:r>
-          </w:p>
-        </w:tc>
-        <w:tc>
-          <w:tcPr>
-            <w:tcBorders>
-              <w:bottom w:val="none" w:sz="0" w:space="0" w:color="000000"/>
-              <w:top w:val="none" w:sz="0" w:space="0" w:color="000000"/>
-              <w:left w:val="none" w:sz="0" w:space="0" w:color="000000"/>
-              <w:right w:val="none" w:sz="0" w:space="0" w:color="000000"/>
-            </w:tcBorders>
-            <w:shd w:val="clear" w:color="auto" w:fill="FFFFFF"/>
-            <w:tcMar>
-              <w:top w:w="0" w:type="dxa"/>
-              <w:bottom w:w="0" w:type="dxa"/>
-              <w:left w:w="0" w:type="dxa"/>
-              <w:right w:w="0" w:type="dxa"/>
-            </w:tcMar>
-            <w:vAlign w:val="center"/>
-          </w:tcPr>
-          <w:p>
-            <w:pPr>
-              <w:pStyle w:val="Normal"/>
-              <w:jc w:val="left"/>
-              <w:pBdr>
-                <w:bottom w:val="none" w:sz="0" w:space="0" w:color="000000"/>
-                <w:top w:val="none" w:sz="0" w:space="0" w:color="000000"/>
-                <w:left w:val="none" w:sz="0" w:space="0" w:color="000000"/>
-                <w:right w:val="none" w:sz="0" w:space="0" w:color="000000"/>
-              </w:pBdr>
-              <w:spacing w:after="100" w:before="100" w:line="240"/>
-              <w:ind w:left="100" w:right="100" w:firstLine="0" w:firstLineChars="0"/>
-              <w:rPr>
-                <w:rFonts w:ascii="Helvetica" w:hAnsi="Helvetica" w:eastAsia="Helvetica" w:cs="Helvetica"/>
-                <w:i w:val="false"/>
-                <w:b w:val="false"/>
-                <w:u w:val="none"/>
-                <w:strike w:val="false"/>
-                <w:sz w:val="22"/>
-                <w:szCs w:val="22"/>
-                <w:color w:val="000000"/>
-              </w:rPr>
-            </w:pPr>
-            <w:r>
-              <w:rPr>
-                <w:rFonts w:ascii="Helvetica" w:hAnsi="Helvetica" w:eastAsia="Helvetica" w:cs="Helvetica"/>
-                <w:i w:val="false"/>
-                <w:b w:val="false"/>
-                <w:u w:val="none"/>
-                <w:strike w:val="false"/>
-                <w:sz w:val="22"/>
-                <w:szCs w:val="22"/>
-                <w:color w:val="000000"/>
-              </w:rPr>
-              <w:t xml:space="preserve">-1.531</w:t>
-            </w:r>
-          </w:p>
-        </w:tc>
-        <w:tc>
-          <w:tcPr>
-            <w:tcBorders>
-              <w:bottom w:val="none" w:sz="0" w:space="0" w:color="000000"/>
-              <w:top w:val="none" w:sz="0" w:space="0" w:color="000000"/>
-              <w:left w:val="none" w:sz="0" w:space="0" w:color="000000"/>
-              <w:right w:val="none" w:sz="0" w:space="0" w:color="000000"/>
-            </w:tcBorders>
-            <w:shd w:val="clear" w:color="auto" w:fill="FFFFFF"/>
-            <w:tcMar>
-              <w:top w:w="0" w:type="dxa"/>
-              <w:bottom w:w="0" w:type="dxa"/>
-              <w:left w:w="0" w:type="dxa"/>
-              <w:right w:w="0" w:type="dxa"/>
-            </w:tcMar>
-            <w:vAlign w:val="center"/>
-          </w:tcPr>
-          <w:p>
-            <w:pPr>
-              <w:pStyle w:val="Normal"/>
-              <w:jc w:val="left"/>
-              <w:pBdr>
-                <w:bottom w:val="none" w:sz="0" w:space="0" w:color="000000"/>
-                <w:top w:val="none" w:sz="0" w:space="0" w:color="000000"/>
-                <w:left w:val="none" w:sz="0" w:space="0" w:color="000000"/>
-                <w:right w:val="none" w:sz="0" w:space="0" w:color="000000"/>
-              </w:pBdr>
-              <w:spacing w:after="100" w:before="100" w:line="240"/>
-              <w:ind w:left="100" w:right="100" w:firstLine="0" w:firstLineChars="0"/>
-              <w:rPr>
-                <w:rFonts w:ascii="Helvetica" w:hAnsi="Helvetica" w:eastAsia="Helvetica" w:cs="Helvetica"/>
-                <w:i w:val="false"/>
-                <w:b w:val="false"/>
-                <w:u w:val="none"/>
-                <w:strike w:val="false"/>
-                <w:sz w:val="22"/>
-                <w:szCs w:val="22"/>
-                <w:color w:val="000000"/>
-              </w:rPr>
-            </w:pPr>
-            <w:r>
-              <w:rPr>
-                <w:rFonts w:ascii="Helvetica" w:hAnsi="Helvetica" w:eastAsia="Helvetica" w:cs="Helvetica"/>
-                <w:i w:val="false"/>
-                <w:b w:val="false"/>
-                <w:u w:val="none"/>
-                <w:strike w:val="false"/>
-                <w:sz w:val="22"/>
-                <w:szCs w:val="22"/>
-                <w:color w:val="000000"/>
-              </w:rPr>
-              <w:t xml:space="preserve">0.024</w:t>
+              <w:t xml:space="preserve">Montane/Subalpine</w:t>
+            </w:r>
+          </w:p>
+        </w:tc>
+        <w:tc>
+          <w:tcPr>
+            <w:tcBorders>
+              <w:bottom w:val="none" w:sz="0" w:space="0" w:color="000000"/>
+              <w:top w:val="none" w:sz="0" w:space="0" w:color="000000"/>
+              <w:left w:val="none" w:sz="0" w:space="0" w:color="000000"/>
+              <w:right w:val="none" w:sz="0" w:space="0" w:color="000000"/>
+            </w:tcBorders>
+            <w:shd w:val="clear" w:color="auto" w:fill="FFFFFF"/>
+            <w:tcMar>
+              <w:top w:w="0" w:type="dxa"/>
+              <w:bottom w:w="0" w:type="dxa"/>
+              <w:left w:w="0" w:type="dxa"/>
+              <w:right w:w="0" w:type="dxa"/>
+            </w:tcMar>
+            <w:vAlign w:val="center"/>
+          </w:tcPr>
+          <w:p>
+            <w:pPr>
+              <w:pStyle w:val="Normal"/>
+              <w:jc w:val="left"/>
+              <w:pBdr>
+                <w:bottom w:val="none" w:sz="0" w:space="0" w:color="000000"/>
+                <w:top w:val="none" w:sz="0" w:space="0" w:color="000000"/>
+                <w:left w:val="none" w:sz="0" w:space="0" w:color="000000"/>
+                <w:right w:val="none" w:sz="0" w:space="0" w:color="000000"/>
+              </w:pBdr>
+              <w:spacing w:after="100" w:before="100" w:line="240"/>
+              <w:ind w:left="100" w:right="100" w:firstLine="0" w:firstLineChars="0"/>
+              <w:rPr>
+                <w:rFonts w:ascii="Helvetica" w:hAnsi="Helvetica" w:eastAsia="Helvetica" w:cs="Helvetica"/>
+                <w:i w:val="false"/>
+                <w:b w:val="false"/>
+                <w:u w:val="none"/>
+                <w:strike w:val="false"/>
+                <w:sz w:val="22"/>
+                <w:szCs w:val="22"/>
+                <w:color w:val="000000"/>
+              </w:rPr>
+            </w:pPr>
+            <w:r>
+              <w:rPr>
+                <w:rFonts w:ascii="Helvetica" w:hAnsi="Helvetica" w:eastAsia="Helvetica" w:cs="Helvetica"/>
+                <w:i w:val="false"/>
+                <w:b w:val="false"/>
+                <w:u w:val="none"/>
+                <w:strike w:val="false"/>
+                <w:sz w:val="22"/>
+                <w:szCs w:val="22"/>
+                <w:color w:val="000000"/>
+              </w:rPr>
+              <w:t xml:space="preserve">0.735</w:t>
+            </w:r>
+          </w:p>
+        </w:tc>
+        <w:tc>
+          <w:tcPr>
+            <w:tcBorders>
+              <w:bottom w:val="none" w:sz="0" w:space="0" w:color="000000"/>
+              <w:top w:val="none" w:sz="0" w:space="0" w:color="000000"/>
+              <w:left w:val="none" w:sz="0" w:space="0" w:color="000000"/>
+              <w:right w:val="none" w:sz="0" w:space="0" w:color="000000"/>
+            </w:tcBorders>
+            <w:shd w:val="clear" w:color="auto" w:fill="FFFFFF"/>
+            <w:tcMar>
+              <w:top w:w="0" w:type="dxa"/>
+              <w:bottom w:w="0" w:type="dxa"/>
+              <w:left w:w="0" w:type="dxa"/>
+              <w:right w:w="0" w:type="dxa"/>
+            </w:tcMar>
+            <w:vAlign w:val="center"/>
+          </w:tcPr>
+          <w:p>
+            <w:pPr>
+              <w:pStyle w:val="Normal"/>
+              <w:jc w:val="left"/>
+              <w:pBdr>
+                <w:bottom w:val="none" w:sz="0" w:space="0" w:color="000000"/>
+                <w:top w:val="none" w:sz="0" w:space="0" w:color="000000"/>
+                <w:left w:val="none" w:sz="0" w:space="0" w:color="000000"/>
+                <w:right w:val="none" w:sz="0" w:space="0" w:color="000000"/>
+              </w:pBdr>
+              <w:spacing w:after="100" w:before="100" w:line="240"/>
+              <w:ind w:left="100" w:right="100" w:firstLine="0" w:firstLineChars="0"/>
+              <w:rPr>
+                <w:rFonts w:ascii="Helvetica" w:hAnsi="Helvetica" w:eastAsia="Helvetica" w:cs="Helvetica"/>
+                <w:i w:val="false"/>
+                <w:b w:val="false"/>
+                <w:u w:val="none"/>
+                <w:strike w:val="false"/>
+                <w:sz w:val="22"/>
+                <w:szCs w:val="22"/>
+                <w:color w:val="000000"/>
+              </w:rPr>
+            </w:pPr>
+            <w:r>
+              <w:rPr>
+                <w:rFonts w:ascii="Helvetica" w:hAnsi="Helvetica" w:eastAsia="Helvetica" w:cs="Helvetica"/>
+                <w:i w:val="false"/>
+                <w:b w:val="false"/>
+                <w:u w:val="none"/>
+                <w:strike w:val="false"/>
+                <w:sz w:val="22"/>
+                <w:szCs w:val="22"/>
+                <w:color w:val="000000"/>
+              </w:rPr>
+              <w:t xml:space="preserve">-1.794</w:t>
+            </w:r>
+          </w:p>
+        </w:tc>
+        <w:tc>
+          <w:tcPr>
+            <w:tcBorders>
+              <w:bottom w:val="none" w:sz="0" w:space="0" w:color="000000"/>
+              <w:top w:val="none" w:sz="0" w:space="0" w:color="000000"/>
+              <w:left w:val="none" w:sz="0" w:space="0" w:color="000000"/>
+              <w:right w:val="none" w:sz="0" w:space="0" w:color="000000"/>
+            </w:tcBorders>
+            <w:shd w:val="clear" w:color="auto" w:fill="FFFFFF"/>
+            <w:tcMar>
+              <w:top w:w="0" w:type="dxa"/>
+              <w:bottom w:w="0" w:type="dxa"/>
+              <w:left w:w="0" w:type="dxa"/>
+              <w:right w:w="0" w:type="dxa"/>
+            </w:tcMar>
+            <w:vAlign w:val="center"/>
+          </w:tcPr>
+          <w:p>
+            <w:pPr>
+              <w:pStyle w:val="Normal"/>
+              <w:jc w:val="left"/>
+              <w:pBdr>
+                <w:bottom w:val="none" w:sz="0" w:space="0" w:color="000000"/>
+                <w:top w:val="none" w:sz="0" w:space="0" w:color="000000"/>
+                <w:left w:val="none" w:sz="0" w:space="0" w:color="000000"/>
+                <w:right w:val="none" w:sz="0" w:space="0" w:color="000000"/>
+              </w:pBdr>
+              <w:spacing w:after="100" w:before="100" w:line="240"/>
+              <w:ind w:left="100" w:right="100" w:firstLine="0" w:firstLineChars="0"/>
+              <w:rPr>
+                <w:rFonts w:ascii="Helvetica" w:hAnsi="Helvetica" w:eastAsia="Helvetica" w:cs="Helvetica"/>
+                <w:i w:val="false"/>
+                <w:b w:val="false"/>
+                <w:u w:val="none"/>
+                <w:strike w:val="false"/>
+                <w:sz w:val="22"/>
+                <w:szCs w:val="22"/>
+                <w:color w:val="000000"/>
+              </w:rPr>
+            </w:pPr>
+            <w:r>
+              <w:rPr>
+                <w:rFonts w:ascii="Helvetica" w:hAnsi="Helvetica" w:eastAsia="Helvetica" w:cs="Helvetica"/>
+                <w:i w:val="false"/>
+                <w:b w:val="false"/>
+                <w:u w:val="none"/>
+                <w:strike w:val="false"/>
+                <w:sz w:val="22"/>
+                <w:szCs w:val="22"/>
+                <w:color w:val="000000"/>
+              </w:rPr>
+              <w:t xml:space="preserve">0.010</w:t>
             </w:r>
           </w:p>
         </w:tc>
@@ -14246,7 +14246,7 @@
                 <w:szCs w:val="22"/>
                 <w:color w:val="000000"/>
               </w:rPr>
-              <w:t xml:space="preserve">0.735</w:t>
+              <w:t xml:space="preserve">0.605</w:t>
             </w:r>
           </w:p>
         </w:tc>
@@ -14301,7 +14301,7 @@
                 <w:szCs w:val="22"/>
                 <w:color w:val="000000"/>
               </w:rPr>
-              <w:t xml:space="preserve">-1.794</w:t>
+              <w:t xml:space="preserve">-1.531</w:t>
             </w:r>
           </w:p>
         </w:tc>
@@ -14356,7 +14356,7 @@
                 <w:szCs w:val="22"/>
                 <w:color w:val="000000"/>
               </w:rPr>
-              <w:t xml:space="preserve">0.010</w:t>
+              <w:t xml:space="preserve">0.024</w:t>
             </w:r>
           </w:p>
         </w:tc>

</xml_diff>